<commit_message>
Add portfolio filter tabs, AI advertisement cards, and Build Playbook
- Add filter tabs (Web Design / AI Advertisements) to homepage and work page
- Homepage: 6 web design + 6 AI video cards with filter toggle
- Work page: 14 web design + 7 AI video cards with All/Web/AI filter
- Video cards feature YouTube thumbnails, play buttons, category tags
- CSS for filter animations, video card hover effects, responsive layout
- JS filter logic with staggered reveal animations
- Updated Build Playbook with comprehensive AI/Claude editing section
- Updated Site Editing Guide (v3)

Co-Authored-By: Claude Opus 4.6 <noreply@anthropic.com>
</commit_message>
<xml_diff>
--- a/Driven-Creations-Site-Editing-Guide.docx
+++ b/Driven-Creations-Site-Editing-Guide.docx
@@ -2,63 +2,477 @@
 <file path=word/document.xml><?xml version="1.0" encoding="utf-8"?>
 <w:document xmlns:wpc="http://schemas.microsoft.com/office/word/2010/wordprocessingCanvas" xmlns:mo="http://schemas.microsoft.com/office/mac/office/2008/main" xmlns:mc="http://schemas.openxmlformats.org/markup-compatibility/2006" xmlns:mv="urn:schemas-microsoft-com:mac:vml" xmlns:o="urn:schemas-microsoft-com:office:office" xmlns:r="http://schemas.openxmlformats.org/officeDocument/2006/relationships" xmlns:m="http://schemas.openxmlformats.org/officeDocument/2006/math" xmlns:v="urn:schemas-microsoft-com:vml" xmlns:wp14="http://schemas.microsoft.com/office/word/2010/wordprocessingDrawing" xmlns:wp="http://schemas.openxmlformats.org/drawingml/2006/wordprocessingDrawing" xmlns:w10="urn:schemas-microsoft-com:office:word" xmlns:w="http://schemas.openxmlformats.org/wordprocessingml/2006/main" xmlns:w14="http://schemas.microsoft.com/office/word/2010/wordml" xmlns:wpg="http://schemas.microsoft.com/office/word/2010/wordprocessingGroup" xmlns:wpi="http://schemas.microsoft.com/office/word/2010/wordprocessingInk" xmlns:wne="http://schemas.microsoft.com/office/word/2006/wordml" xmlns:wps="http://schemas.microsoft.com/office/word/2010/wordprocessingShape" mc:Ignorable="w14 wp14">
   <w:body>
+    <w:p/>
+    <w:p/>
+    <w:p/>
+    <w:p/>
     <w:p>
       <w:pPr>
-        <w:pStyle w:val="Title"/>
         <w:jc w:val="center"/>
       </w:pPr>
       <w:r>
-        <w:t>How to Edit the Driven Creations Website</w:t>
+        <w:rPr>
+          <w:rFonts w:ascii="Georgia" w:hAnsi="Georgia"/>
+          <w:b/>
+          <w:color w:val="7C3AED"/>
+          <w:sz w:val="28"/>
+        </w:rPr>
+        <w:t>DRIVEN CREATIONS</w:t>
       </w:r>
     </w:p>
     <w:p>
       <w:pPr>
+        <w:spacing w:before="0" w:after="80"/>
+      </w:pPr>
+    </w:p>
+    <w:p>
+      <w:pPr>
         <w:jc w:val="center"/>
       </w:pPr>
       <w:r>
         <w:rPr>
-          <w:b/>
+          <w:color w:val="A78BFA"/>
           <w:sz w:val="28"/>
         </w:rPr>
-        <w:t>A Super Simple Guide</w:t>
+        <w:t>_______________</w:t>
+      </w:r>
+    </w:p>
+    <w:p>
+      <w:pPr>
+        <w:spacing w:before="0" w:after="160"/>
+      </w:pPr>
+    </w:p>
+    <w:p>
+      <w:pPr>
+        <w:jc w:val="center"/>
+      </w:pPr>
+      <w:r>
+        <w:rPr>
+          <w:rFonts w:ascii="Georgia" w:hAnsi="Georgia"/>
+          <w:b/>
+          <w:color w:val="1A1A2E"/>
+          <w:sz w:val="72"/>
+        </w:rPr>
+        <w:t>Site Editing Guide</w:t>
+      </w:r>
+    </w:p>
+    <w:p>
+      <w:pPr>
+        <w:spacing w:before="0" w:after="80"/>
+      </w:pPr>
+    </w:p>
+    <w:p>
+      <w:pPr>
+        <w:jc w:val="center"/>
+      </w:pPr>
+      <w:r>
+        <w:rPr>
+          <w:rFonts w:ascii="Calibri" w:hAnsi="Calibri"/>
+          <w:color w:val="6B6B6B"/>
+          <w:sz w:val="26"/>
+        </w:rPr>
+        <w:t>Everything you need to update, manage,</w:t>
+      </w:r>
+    </w:p>
+    <w:p>
+      <w:pPr>
+        <w:jc w:val="center"/>
+      </w:pPr>
+      <w:r>
+        <w:rPr>
+          <w:rFonts w:ascii="Calibri" w:hAnsi="Calibri"/>
+          <w:color w:val="6B6B6B"/>
+          <w:sz w:val="26"/>
+        </w:rPr>
+        <w:t>and deploy your website.</w:t>
       </w:r>
     </w:p>
     <w:p/>
+    <w:p/>
+    <w:p/>
+    <w:p/>
+    <w:p/>
+    <w:p/>
     <w:p>
       <w:pPr>
-        <w:pStyle w:val="Heading1"/>
+        <w:jc w:val="center"/>
       </w:pPr>
       <w:r>
-        <w:t>1. Important Links (Bookmark These!)</w:t>
+        <w:rPr>
+          <w:rFonts w:ascii="Calibri" w:hAnsi="Calibri"/>
+          <w:b/>
+          <w:color w:val="7C3AED"/>
+          <w:sz w:val="22"/>
+        </w:rPr>
+        <w:t>drivencreations.com</w:t>
       </w:r>
+    </w:p>
+    <w:p>
+      <w:pPr>
+        <w:jc w:val="center"/>
+      </w:pPr>
+      <w:r>
+        <w:rPr>
+          <w:rFonts w:ascii="Calibri" w:hAnsi="Calibri"/>
+          <w:color w:val="6B6B6B"/>
+          <w:sz w:val="18"/>
+        </w:rPr>
+        <w:t>Last Updated: February 23, 2026</w:t>
+      </w:r>
+    </w:p>
+    <w:p>
+      <w:r>
+        <w:br w:type="page"/>
+      </w:r>
+    </w:p>
+    <w:p>
+      <w:pPr>
+        <w:jc w:val="center"/>
+      </w:pPr>
+      <w:r>
+        <w:rPr>
+          <w:rFonts w:ascii="Georgia" w:hAnsi="Georgia"/>
+          <w:b/>
+          <w:color w:val="1A1A2E"/>
+          <w:sz w:val="36"/>
+        </w:rPr>
+        <w:t>CONTENTS</w:t>
+      </w:r>
+    </w:p>
+    <w:p>
+      <w:pPr>
+        <w:spacing w:before="0" w:after="160"/>
+      </w:pPr>
+    </w:p>
+    <w:p>
+      <w:pPr>
+        <w:spacing w:after="160"/>
+      </w:pPr>
+      <w:r>
+        <w:rPr>
+          <w:rFonts w:ascii="Georgia" w:hAnsi="Georgia"/>
+          <w:b/>
+          <w:color w:val="7C3AED"/>
+          <w:sz w:val="28"/>
+        </w:rPr>
+        <w:t xml:space="preserve">01   </w:t>
+      </w:r>
+      <w:r>
+        <w:rPr>
+          <w:rFonts w:ascii="Calibri" w:hAnsi="Calibri"/>
+          <w:color w:val="1A1A2E"/>
+          <w:sz w:val="24"/>
+        </w:rPr>
+        <w:t>Important Links</w:t>
+      </w:r>
+    </w:p>
+    <w:p>
+      <w:pPr>
+        <w:spacing w:after="160"/>
+      </w:pPr>
+      <w:r>
+        <w:rPr>
+          <w:rFonts w:ascii="Georgia" w:hAnsi="Georgia"/>
+          <w:b/>
+          <w:color w:val="7C3AED"/>
+          <w:sz w:val="28"/>
+        </w:rPr>
+        <w:t xml:space="preserve">02   </w:t>
+      </w:r>
+      <w:r>
+        <w:rPr>
+          <w:rFonts w:ascii="Calibri" w:hAnsi="Calibri"/>
+          <w:color w:val="1A1A2E"/>
+          <w:sz w:val="24"/>
+        </w:rPr>
+        <w:t>Where Are the Files</w:t>
+      </w:r>
+    </w:p>
+    <w:p>
+      <w:pPr>
+        <w:spacing w:after="160"/>
+      </w:pPr>
+      <w:r>
+        <w:rPr>
+          <w:rFonts w:ascii="Georgia" w:hAnsi="Georgia"/>
+          <w:b/>
+          <w:color w:val="7C3AED"/>
+          <w:sz w:val="28"/>
+        </w:rPr>
+        <w:t xml:space="preserve">03   </w:t>
+      </w:r>
+      <w:r>
+        <w:rPr>
+          <w:rFonts w:ascii="Calibri" w:hAnsi="Calibri"/>
+          <w:color w:val="1A1A2E"/>
+          <w:sz w:val="24"/>
+        </w:rPr>
+        <w:t>How to Change Text</w:t>
+      </w:r>
+    </w:p>
+    <w:p>
+      <w:pPr>
+        <w:spacing w:after="160"/>
+      </w:pPr>
+      <w:r>
+        <w:rPr>
+          <w:rFonts w:ascii="Georgia" w:hAnsi="Georgia"/>
+          <w:b/>
+          <w:color w:val="7C3AED"/>
+          <w:sz w:val="28"/>
+        </w:rPr>
+        <w:t xml:space="preserve">04   </w:t>
+      </w:r>
+      <w:r>
+        <w:rPr>
+          <w:rFonts w:ascii="Calibri" w:hAnsi="Calibri"/>
+          <w:color w:val="1A1A2E"/>
+          <w:sz w:val="24"/>
+        </w:rPr>
+        <w:t>How to Change Images</w:t>
+      </w:r>
+    </w:p>
+    <w:p>
+      <w:pPr>
+        <w:spacing w:after="160"/>
+      </w:pPr>
+      <w:r>
+        <w:rPr>
+          <w:rFonts w:ascii="Georgia" w:hAnsi="Georgia"/>
+          <w:b/>
+          <w:color w:val="7C3AED"/>
+          <w:sz w:val="28"/>
+        </w:rPr>
+        <w:t xml:space="preserve">05   </w:t>
+      </w:r>
+      <w:r>
+        <w:rPr>
+          <w:rFonts w:ascii="Calibri" w:hAnsi="Calibri"/>
+          <w:color w:val="1A1A2E"/>
+          <w:sz w:val="24"/>
+        </w:rPr>
+        <w:t>How to Change the YouTube Video</w:t>
+      </w:r>
+    </w:p>
+    <w:p>
+      <w:pPr>
+        <w:spacing w:after="160"/>
+      </w:pPr>
+      <w:r>
+        <w:rPr>
+          <w:rFonts w:ascii="Georgia" w:hAnsi="Georgia"/>
+          <w:b/>
+          <w:color w:val="7C3AED"/>
+          <w:sz w:val="28"/>
+        </w:rPr>
+        <w:t xml:space="preserve">06   </w:t>
+      </w:r>
+      <w:r>
+        <w:rPr>
+          <w:rFonts w:ascii="Calibri" w:hAnsi="Calibri"/>
+          <w:color w:val="1A1A2E"/>
+          <w:sz w:val="24"/>
+        </w:rPr>
+        <w:t>How to Push Changes Live</w:t>
+      </w:r>
+    </w:p>
+    <w:p>
+      <w:pPr>
+        <w:spacing w:after="160"/>
+      </w:pPr>
+      <w:r>
+        <w:rPr>
+          <w:rFonts w:ascii="Georgia" w:hAnsi="Georgia"/>
+          <w:b/>
+          <w:color w:val="7C3AED"/>
+          <w:sz w:val="28"/>
+        </w:rPr>
+        <w:t xml:space="preserve">07   </w:t>
+      </w:r>
+      <w:r>
+        <w:rPr>
+          <w:rFonts w:ascii="Calibri" w:hAnsi="Calibri"/>
+          <w:color w:val="1A1A2E"/>
+          <w:sz w:val="24"/>
+        </w:rPr>
+        <w:t>Editing with AI Tools</w:t>
+      </w:r>
+    </w:p>
+    <w:p>
+      <w:pPr>
+        <w:spacing w:after="160"/>
+      </w:pPr>
+      <w:r>
+        <w:rPr>
+          <w:rFonts w:ascii="Georgia" w:hAnsi="Georgia"/>
+          <w:b/>
+          <w:color w:val="7C3AED"/>
+          <w:sz w:val="28"/>
+        </w:rPr>
+        <w:t xml:space="preserve">08   </w:t>
+      </w:r>
+      <w:r>
+        <w:rPr>
+          <w:rFonts w:ascii="Calibri" w:hAnsi="Calibri"/>
+          <w:color w:val="1A1A2E"/>
+          <w:sz w:val="24"/>
+        </w:rPr>
+        <w:t>Adding a New Project Page</w:t>
+      </w:r>
+    </w:p>
+    <w:p>
+      <w:pPr>
+        <w:spacing w:after="160"/>
+      </w:pPr>
+      <w:r>
+        <w:rPr>
+          <w:rFonts w:ascii="Georgia" w:hAnsi="Georgia"/>
+          <w:b/>
+          <w:color w:val="7C3AED"/>
+          <w:sz w:val="28"/>
+        </w:rPr>
+        <w:t xml:space="preserve">09   </w:t>
+      </w:r>
+      <w:r>
+        <w:rPr>
+          <w:rFonts w:ascii="Calibri" w:hAnsi="Calibri"/>
+          <w:color w:val="1A1A2E"/>
+          <w:sz w:val="24"/>
+        </w:rPr>
+        <w:t>Quick Reference Table</w:t>
+      </w:r>
+    </w:p>
+    <w:p>
+      <w:pPr>
+        <w:spacing w:after="160"/>
+      </w:pPr>
+      <w:r>
+        <w:rPr>
+          <w:rFonts w:ascii="Georgia" w:hAnsi="Georgia"/>
+          <w:b/>
+          <w:color w:val="7C3AED"/>
+          <w:sz w:val="28"/>
+        </w:rPr>
+        <w:t xml:space="preserve">10   </w:t>
+      </w:r>
+      <w:r>
+        <w:rPr>
+          <w:rFonts w:ascii="Calibri" w:hAnsi="Calibri"/>
+          <w:color w:val="1A1A2E"/>
+          <w:sz w:val="24"/>
+        </w:rPr>
+        <w:t>Troubleshooting</w:t>
+      </w:r>
+    </w:p>
+    <w:p>
+      <w:r>
+        <w:br w:type="page"/>
+      </w:r>
+    </w:p>
+    <w:p>
+      <w:r>
+        <w:rPr>
+          <w:rFonts w:ascii="Georgia" w:hAnsi="Georgia"/>
+          <w:b/>
+          <w:color w:val="7C3AED"/>
+          <w:sz w:val="56"/>
+        </w:rPr>
+        <w:t xml:space="preserve">01  </w:t>
+      </w:r>
+      <w:r>
+        <w:rPr>
+          <w:rFonts w:ascii="Calibri" w:hAnsi="Calibri"/>
+          <w:b/>
+          <w:color w:val="1A1A2E"/>
+          <w:sz w:val="28"/>
+        </w:rPr>
+        <w:t>IMPORTANT LINKS</w:t>
+      </w:r>
+    </w:p>
+    <w:p>
+      <w:r>
+        <w:rPr>
+          <w:color w:val="A78BFA"/>
+          <w:sz w:val="12"/>
+        </w:rPr>
+        <w:t>________________________________________________________________________</w:t>
+      </w:r>
+    </w:p>
+    <w:p>
+      <w:pPr>
+        <w:spacing w:before="0" w:after="120"/>
+      </w:pPr>
+    </w:p>
+    <w:p>
+      <w:pPr>
+        <w:spacing w:after="80" w:line="312" w:lineRule="auto"/>
+      </w:pPr>
+      <w:r>
+        <w:rPr>
+          <w:rFonts w:ascii="Calibri" w:hAnsi="Calibri"/>
+          <w:b w:val="0"/>
+          <w:i w:val="0"/>
+          <w:sz w:val="22"/>
+        </w:rPr>
+        <w:t>Bookmark these links. You will need them to manage your website.</w:t>
+      </w:r>
+    </w:p>
+    <w:p>
+      <w:pPr>
+        <w:spacing w:before="0" w:after="80"/>
+      </w:pPr>
     </w:p>
     <w:tbl>
       <w:tblPr>
-        <w:tblStyle w:val="LightGrid-Accent1"/>
         <w:tblW w:type="auto" w:w="0"/>
+        <w:jc w:val="center"/>
         <w:tblLook w:firstColumn="1" w:firstRow="1" w:lastColumn="0" w:lastRow="0" w:noHBand="0" w:noVBand="1" w:val="04A0"/>
+        <w:tblBorders>
+          <w:top w:val="single" w:sz="4" w:space="0" w:color="E0D8F0"/>
+          <w:left w:val="single" w:sz="4" w:space="0" w:color="E0D8F0"/>
+          <w:bottom w:val="single" w:sz="4" w:space="0" w:color="E0D8F0"/>
+          <w:right w:val="single" w:sz="4" w:space="0" w:color="E0D8F0"/>
+          <w:insideH w:val="single" w:sz="4" w:space="0" w:color="E0D8F0"/>
+          <w:insideV w:val="single" w:sz="4" w:space="0" w:color="E0D8F0"/>
+        </w:tblBorders>
       </w:tblPr>
       <w:tblGrid>
-        <w:gridCol w:w="4320"/>
-        <w:gridCol w:w="4320"/>
+        <w:gridCol w:w="4703"/>
+        <w:gridCol w:w="4703"/>
       </w:tblGrid>
       <w:tr>
         <w:tc>
           <w:tcPr>
-            <w:tcW w:type="dxa" w:w="4320"/>
+            <w:tcW w:type="dxa" w:w="4703"/>
+            <w:shd w:fill="7C3AED"/>
           </w:tcPr>
           <w:p>
+            <w:r/>
             <w:r>
+              <w:rPr>
+                <w:rFonts w:ascii="Calibri" w:hAnsi="Calibri"/>
+                <w:b/>
+                <w:color w:val="FFFFFF"/>
+                <w:sz w:val="20"/>
+              </w:rPr>
               <w:t>What</w:t>
             </w:r>
           </w:p>
         </w:tc>
         <w:tc>
           <w:tcPr>
-            <w:tcW w:type="dxa" w:w="4320"/>
+            <w:tcW w:type="dxa" w:w="4703"/>
+            <w:shd w:fill="7C3AED"/>
           </w:tcPr>
           <w:p>
+            <w:r/>
             <w:r>
+              <w:rPr>
+                <w:rFonts w:ascii="Calibri" w:hAnsi="Calibri"/>
+                <w:b/>
+                <w:color w:val="FFFFFF"/>
+                <w:sz w:val="20"/>
+              </w:rPr>
               <w:t>Link</w:t>
             </w:r>
           </w:p>
@@ -67,20 +481,32 @@
       <w:tr>
         <w:tc>
           <w:tcPr>
-            <w:tcW w:type="dxa" w:w="4320"/>
+            <w:tcW w:type="dxa" w:w="4703"/>
           </w:tcPr>
           <w:p>
+            <w:r/>
             <w:r>
+              <w:rPr>
+                <w:rFonts w:ascii="Calibri" w:hAnsi="Calibri"/>
+                <w:color w:val="1A1A2E"/>
+                <w:sz w:val="20"/>
+              </w:rPr>
               <w:t>Your Live Website</w:t>
             </w:r>
           </w:p>
         </w:tc>
         <w:tc>
           <w:tcPr>
-            <w:tcW w:type="dxa" w:w="4320"/>
+            <w:tcW w:type="dxa" w:w="4703"/>
           </w:tcPr>
           <w:p>
+            <w:r/>
             <w:r>
+              <w:rPr>
+                <w:rFonts w:ascii="Calibri" w:hAnsi="Calibri"/>
+                <w:color w:val="1A1A2E"/>
+                <w:sz w:val="20"/>
+              </w:rPr>
               <w:t>https://www.drivencreations.com</w:t>
             </w:r>
           </w:p>
@@ -89,20 +515,34 @@
       <w:tr>
         <w:tc>
           <w:tcPr>
-            <w:tcW w:type="dxa" w:w="4320"/>
+            <w:tcW w:type="dxa" w:w="4703"/>
+            <w:shd w:fill="F8F6FF"/>
           </w:tcPr>
           <w:p>
+            <w:r/>
             <w:r>
+              <w:rPr>
+                <w:rFonts w:ascii="Calibri" w:hAnsi="Calibri"/>
+                <w:color w:val="1A1A2E"/>
+                <w:sz w:val="20"/>
+              </w:rPr>
               <w:t>GitHub (Code Backup)</w:t>
             </w:r>
           </w:p>
         </w:tc>
         <w:tc>
           <w:tcPr>
-            <w:tcW w:type="dxa" w:w="4320"/>
+            <w:tcW w:type="dxa" w:w="4703"/>
+            <w:shd w:fill="F8F6FF"/>
           </w:tcPr>
           <w:p>
+            <w:r/>
             <w:r>
+              <w:rPr>
+                <w:rFonts w:ascii="Calibri" w:hAnsi="Calibri"/>
+                <w:color w:val="1A1A2E"/>
+                <w:sz w:val="20"/>
+              </w:rPr>
               <w:t>https://github.com/davisd11988/driven-creations-webflow</w:t>
             </w:r>
           </w:p>
@@ -111,20 +551,32 @@
       <w:tr>
         <w:tc>
           <w:tcPr>
-            <w:tcW w:type="dxa" w:w="4320"/>
+            <w:tcW w:type="dxa" w:w="4703"/>
           </w:tcPr>
           <w:p>
+            <w:r/>
             <w:r>
+              <w:rPr>
+                <w:rFonts w:ascii="Calibri" w:hAnsi="Calibri"/>
+                <w:color w:val="1A1A2E"/>
+                <w:sz w:val="20"/>
+              </w:rPr>
               <w:t>Vercel (Hosting)</w:t>
             </w:r>
           </w:p>
         </w:tc>
         <w:tc>
           <w:tcPr>
-            <w:tcW w:type="dxa" w:w="4320"/>
+            <w:tcW w:type="dxa" w:w="4703"/>
           </w:tcPr>
           <w:p>
+            <w:r/>
             <w:r>
+              <w:rPr>
+                <w:rFonts w:ascii="Calibri" w:hAnsi="Calibri"/>
+                <w:color w:val="1A1A2E"/>
+                <w:sz w:val="20"/>
+              </w:rPr>
               <w:t>https://vercel.com/derricks-projects-85a0451e/driven-creations-webflow</w:t>
             </w:r>
           </w:p>
@@ -133,20 +585,34 @@
       <w:tr>
         <w:tc>
           <w:tcPr>
-            <w:tcW w:type="dxa" w:w="4320"/>
+            <w:tcW w:type="dxa" w:w="4703"/>
+            <w:shd w:fill="F8F6FF"/>
           </w:tcPr>
           <w:p>
+            <w:r/>
             <w:r>
-              <w:t>GoDaddy (Domain/DNS)</w:t>
+              <w:rPr>
+                <w:rFonts w:ascii="Calibri" w:hAnsi="Calibri"/>
+                <w:color w:val="1A1A2E"/>
+                <w:sz w:val="20"/>
+              </w:rPr>
+              <w:t>GoDaddy (Domain / DNS)</w:t>
             </w:r>
           </w:p>
         </w:tc>
         <w:tc>
           <w:tcPr>
-            <w:tcW w:type="dxa" w:w="4320"/>
+            <w:tcW w:type="dxa" w:w="4703"/>
+            <w:shd w:fill="F8F6FF"/>
           </w:tcPr>
           <w:p>
+            <w:r/>
             <w:r>
+              <w:rPr>
+                <w:rFonts w:ascii="Calibri" w:hAnsi="Calibri"/>
+                <w:color w:val="1A1A2E"/>
+                <w:sz w:val="20"/>
+              </w:rPr>
               <w:t>https://dcc.godaddy.com/control/drivencreations.com/dns</w:t>
             </w:r>
           </w:p>
@@ -156,59 +622,152 @@
     <w:p/>
     <w:p>
       <w:pPr>
-        <w:pStyle w:val="Heading1"/>
+        <w:shd w:fill="F5F0FF" w:val="clear"/>
+        <w:spacing w:before="120" w:after="120"/>
       </w:pPr>
       <w:r>
-        <w:t>2. Where Are the Files?</w:t>
+        <w:rPr>
+          <w:rFonts w:ascii="Calibri" w:hAnsi="Calibri"/>
+          <w:b/>
+          <w:color w:val="FFFFFF"/>
+          <w:sz w:val="18"/>
+        </w:rPr>
+        <w:t xml:space="preserve">  TIP  </w:t>
+      </w:r>
+      <w:r>
+        <w:rPr>
+          <w:rFonts w:ascii="Calibri" w:hAnsi="Calibri"/>
+          <w:i/>
+          <w:color w:val="7C3AED"/>
+          <w:sz w:val="20"/>
+        </w:rPr>
+        <w:t xml:space="preserve">  Your site is hosted on Vercel's free Hobby plan. It costs $0/month and includes 100 GB bandwidth, unlimited deploys, free SSL, and a global CDN.</w:t>
       </w:r>
     </w:p>
     <w:p>
+      <w:pPr>
+        <w:spacing w:before="0" w:after="160"/>
+      </w:pPr>
+    </w:p>
+    <w:p>
       <w:r>
-        <w:t>All your website files live in a folder on your Desktop:</w:t>
+        <w:rPr>
+          <w:rFonts w:ascii="Georgia" w:hAnsi="Georgia"/>
+          <w:b/>
+          <w:color w:val="7C3AED"/>
+          <w:sz w:val="56"/>
+        </w:rPr>
+        <w:t xml:space="preserve">02  </w:t>
+      </w:r>
+      <w:r>
+        <w:rPr>
+          <w:rFonts w:ascii="Calibri" w:hAnsi="Calibri"/>
+          <w:b/>
+          <w:color w:val="1A1A2E"/>
+          <w:sz w:val="28"/>
+        </w:rPr>
+        <w:t>WHERE ARE THE FILES</w:t>
       </w:r>
     </w:p>
     <w:p>
       <w:r>
         <w:rPr>
-          <w:b/>
-          <w:sz w:val="26"/>
+          <w:color w:val="A78BFA"/>
+          <w:sz w:val="12"/>
         </w:rPr>
-        <w:t>📁 Desktop → driven-creations-webflow</w:t>
+        <w:t>________________________________________________________________________</w:t>
       </w:r>
     </w:p>
-    <w:p/>
     <w:p>
+      <w:pPr>
+        <w:spacing w:before="0" w:after="120"/>
+      </w:pPr>
+    </w:p>
+    <w:p>
+      <w:pPr>
+        <w:spacing w:after="80" w:line="312" w:lineRule="auto"/>
+      </w:pPr>
       <w:r>
-        <w:t>Inside that folder, here are the main files:</w:t>
+        <w:rPr>
+          <w:rFonts w:ascii="Calibri" w:hAnsi="Calibri"/>
+          <w:b w:val="0"/>
+          <w:i w:val="0"/>
+          <w:sz w:val="22"/>
+        </w:rPr>
+        <w:t>All your website files live in one folder on your Desktop:</w:t>
       </w:r>
+    </w:p>
+    <w:p>
+      <w:pPr>
+        <w:shd w:fill="F0EDFA" w:val="clear"/>
+        <w:spacing w:before="160" w:after="160"/>
+      </w:pPr>
+      <w:r>
+        <w:rPr>
+          <w:rFonts w:ascii="Consolas" w:hAnsi="Consolas"/>
+          <w:b/>
+          <w:color w:val="7C3AED"/>
+          <w:sz w:val="20"/>
+        </w:rPr>
+        <w:t>Desktop  &gt;  driven-creations-webflow</w:t>
+      </w:r>
+    </w:p>
+    <w:p>
+      <w:pPr>
+        <w:spacing w:before="0" w:after="80"/>
+      </w:pPr>
     </w:p>
     <w:tbl>
       <w:tblPr>
-        <w:tblStyle w:val="LightGrid-Accent1"/>
         <w:tblW w:type="auto" w:w="0"/>
+        <w:jc w:val="center"/>
         <w:tblLook w:firstColumn="1" w:firstRow="1" w:lastColumn="0" w:lastRow="0" w:noHBand="0" w:noVBand="1" w:val="04A0"/>
+        <w:tblBorders>
+          <w:top w:val="single" w:sz="4" w:space="0" w:color="E0D8F0"/>
+          <w:left w:val="single" w:sz="4" w:space="0" w:color="E0D8F0"/>
+          <w:bottom w:val="single" w:sz="4" w:space="0" w:color="E0D8F0"/>
+          <w:right w:val="single" w:sz="4" w:space="0" w:color="E0D8F0"/>
+          <w:insideH w:val="single" w:sz="4" w:space="0" w:color="E0D8F0"/>
+          <w:insideV w:val="single" w:sz="4" w:space="0" w:color="E0D8F0"/>
+        </w:tblBorders>
       </w:tblPr>
       <w:tblGrid>
-        <w:gridCol w:w="4320"/>
-        <w:gridCol w:w="4320"/>
+        <w:gridCol w:w="4703"/>
+        <w:gridCol w:w="4703"/>
       </w:tblGrid>
       <w:tr>
         <w:tc>
           <w:tcPr>
-            <w:tcW w:type="dxa" w:w="4320"/>
+            <w:tcW w:type="dxa" w:w="4703"/>
+            <w:shd w:fill="7C3AED"/>
           </w:tcPr>
           <w:p>
+            <w:r/>
             <w:r>
+              <w:rPr>
+                <w:rFonts w:ascii="Calibri" w:hAnsi="Calibri"/>
+                <w:b/>
+                <w:color w:val="FFFFFF"/>
+                <w:sz w:val="20"/>
+              </w:rPr>
               <w:t>File</w:t>
             </w:r>
           </w:p>
         </w:tc>
         <w:tc>
           <w:tcPr>
-            <w:tcW w:type="dxa" w:w="4320"/>
+            <w:tcW w:type="dxa" w:w="4703"/>
+            <w:shd w:fill="7C3AED"/>
           </w:tcPr>
           <w:p>
+            <w:r/>
             <w:r>
+              <w:rPr>
+                <w:rFonts w:ascii="Calibri" w:hAnsi="Calibri"/>
+                <w:b/>
+                <w:color w:val="FFFFFF"/>
+                <w:sz w:val="20"/>
+              </w:rPr>
               <w:t>What It Is</w:t>
             </w:r>
           </w:p>
@@ -217,20 +776,32 @@
       <w:tr>
         <w:tc>
           <w:tcPr>
-            <w:tcW w:type="dxa" w:w="4320"/>
+            <w:tcW w:type="dxa" w:w="4703"/>
           </w:tcPr>
           <w:p>
+            <w:r/>
             <w:r>
+              <w:rPr>
+                <w:rFonts w:ascii="Calibri" w:hAnsi="Calibri"/>
+                <w:color w:val="1A1A2E"/>
+                <w:sz w:val="20"/>
+              </w:rPr>
               <w:t>index.html</w:t>
             </w:r>
           </w:p>
         </w:tc>
         <w:tc>
           <w:tcPr>
-            <w:tcW w:type="dxa" w:w="4320"/>
+            <w:tcW w:type="dxa" w:w="4703"/>
           </w:tcPr>
           <w:p>
+            <w:r/>
             <w:r>
+              <w:rPr>
+                <w:rFonts w:ascii="Calibri" w:hAnsi="Calibri"/>
+                <w:color w:val="1A1A2E"/>
+                <w:sz w:val="20"/>
+              </w:rPr>
               <w:t>Homepage</w:t>
             </w:r>
           </w:p>
@@ -239,20 +810,34 @@
       <w:tr>
         <w:tc>
           <w:tcPr>
-            <w:tcW w:type="dxa" w:w="4320"/>
+            <w:tcW w:type="dxa" w:w="4703"/>
+            <w:shd w:fill="F8F6FF"/>
           </w:tcPr>
           <w:p>
+            <w:r/>
             <w:r>
+              <w:rPr>
+                <w:rFonts w:ascii="Calibri" w:hAnsi="Calibri"/>
+                <w:color w:val="1A1A2E"/>
+                <w:sz w:val="20"/>
+              </w:rPr>
               <w:t>about.html</w:t>
             </w:r>
           </w:p>
         </w:tc>
         <w:tc>
           <w:tcPr>
-            <w:tcW w:type="dxa" w:w="4320"/>
+            <w:tcW w:type="dxa" w:w="4703"/>
+            <w:shd w:fill="F8F6FF"/>
           </w:tcPr>
           <w:p>
+            <w:r/>
             <w:r>
+              <w:rPr>
+                <w:rFonts w:ascii="Calibri" w:hAnsi="Calibri"/>
+                <w:color w:val="1A1A2E"/>
+                <w:sz w:val="20"/>
+              </w:rPr>
               <w:t>About Page</w:t>
             </w:r>
           </w:p>
@@ -261,20 +846,32 @@
       <w:tr>
         <w:tc>
           <w:tcPr>
-            <w:tcW w:type="dxa" w:w="4320"/>
+            <w:tcW w:type="dxa" w:w="4703"/>
           </w:tcPr>
           <w:p>
+            <w:r/>
             <w:r>
+              <w:rPr>
+                <w:rFonts w:ascii="Calibri" w:hAnsi="Calibri"/>
+                <w:color w:val="1A1A2E"/>
+                <w:sz w:val="20"/>
+              </w:rPr>
               <w:t>services.html</w:t>
             </w:r>
           </w:p>
         </w:tc>
         <w:tc>
           <w:tcPr>
-            <w:tcW w:type="dxa" w:w="4320"/>
+            <w:tcW w:type="dxa" w:w="4703"/>
           </w:tcPr>
           <w:p>
+            <w:r/>
             <w:r>
+              <w:rPr>
+                <w:rFonts w:ascii="Calibri" w:hAnsi="Calibri"/>
+                <w:color w:val="1A1A2E"/>
+                <w:sz w:val="20"/>
+              </w:rPr>
               <w:t>Services Page</w:t>
             </w:r>
           </w:p>
@@ -283,21 +880,35 @@
       <w:tr>
         <w:tc>
           <w:tcPr>
-            <w:tcW w:type="dxa" w:w="4320"/>
+            <w:tcW w:type="dxa" w:w="4703"/>
+            <w:shd w:fill="F8F6FF"/>
           </w:tcPr>
           <w:p>
+            <w:r/>
             <w:r>
+              <w:rPr>
+                <w:rFonts w:ascii="Calibri" w:hAnsi="Calibri"/>
+                <w:color w:val="1A1A2E"/>
+                <w:sz w:val="20"/>
+              </w:rPr>
               <w:t>work.html</w:t>
             </w:r>
           </w:p>
         </w:tc>
         <w:tc>
           <w:tcPr>
-            <w:tcW w:type="dxa" w:w="4320"/>
+            <w:tcW w:type="dxa" w:w="4703"/>
+            <w:shd w:fill="F8F6FF"/>
           </w:tcPr>
           <w:p>
+            <w:r/>
             <w:r>
-              <w:t>Work/Portfolio Page</w:t>
+              <w:rPr>
+                <w:rFonts w:ascii="Calibri" w:hAnsi="Calibri"/>
+                <w:color w:val="1A1A2E"/>
+                <w:sz w:val="20"/>
+              </w:rPr>
+              <w:t>Work / Portfolio Page</w:t>
             </w:r>
           </w:p>
         </w:tc>
@@ -305,20 +916,32 @@
       <w:tr>
         <w:tc>
           <w:tcPr>
-            <w:tcW w:type="dxa" w:w="4320"/>
+            <w:tcW w:type="dxa" w:w="4703"/>
           </w:tcPr>
           <w:p>
+            <w:r/>
             <w:r>
+              <w:rPr>
+                <w:rFonts w:ascii="Calibri" w:hAnsi="Calibri"/>
+                <w:color w:val="1A1A2E"/>
+                <w:sz w:val="20"/>
+              </w:rPr>
               <w:t>contact-us.html</w:t>
             </w:r>
           </w:p>
         </w:tc>
         <w:tc>
           <w:tcPr>
-            <w:tcW w:type="dxa" w:w="4320"/>
+            <w:tcW w:type="dxa" w:w="4703"/>
           </w:tcPr>
           <w:p>
+            <w:r/>
             <w:r>
+              <w:rPr>
+                <w:rFonts w:ascii="Calibri" w:hAnsi="Calibri"/>
+                <w:color w:val="1A1A2E"/>
+                <w:sz w:val="20"/>
+              </w:rPr>
               <w:t>Contact Us Page</w:t>
             </w:r>
           </w:p>
@@ -327,21 +950,175 @@
       <w:tr>
         <w:tc>
           <w:tcPr>
-            <w:tcW w:type="dxa" w:w="4320"/>
+            <w:tcW w:type="dxa" w:w="4703"/>
+            <w:shd w:fill="F8F6FF"/>
           </w:tcPr>
           <w:p>
+            <w:r/>
             <w:r>
+              <w:rPr>
+                <w:rFonts w:ascii="Calibri" w:hAnsi="Calibri"/>
+                <w:color w:val="1A1A2E"/>
+                <w:sz w:val="20"/>
+              </w:rPr>
               <w:t>work/ folder</w:t>
             </w:r>
           </w:p>
         </w:tc>
         <w:tc>
           <w:tcPr>
-            <w:tcW w:type="dxa" w:w="4320"/>
+            <w:tcW w:type="dxa" w:w="4703"/>
+            <w:shd w:fill="F8F6FF"/>
           </w:tcPr>
           <w:p>
+            <w:r/>
             <w:r>
-              <w:t>All 15 project subpages (1choice.html, acelar.html, etc.)</w:t>
+              <w:rPr>
+                <w:rFonts w:ascii="Calibri" w:hAnsi="Calibri"/>
+                <w:color w:val="1A1A2E"/>
+                <w:sz w:val="20"/>
+              </w:rPr>
+              <w:t>All 15 project case study pages</w:t>
+            </w:r>
+          </w:p>
+        </w:tc>
+      </w:tr>
+      <w:tr>
+        <w:tc>
+          <w:tcPr>
+            <w:tcW w:type="dxa" w:w="4703"/>
+          </w:tcPr>
+          <w:p>
+            <w:r/>
+            <w:r>
+              <w:rPr>
+                <w:rFonts w:ascii="Calibri" w:hAnsi="Calibri"/>
+                <w:color w:val="1A1A2E"/>
+                <w:sz w:val="20"/>
+              </w:rPr>
+              <w:t>css/shared.css</w:t>
+            </w:r>
+          </w:p>
+        </w:tc>
+        <w:tc>
+          <w:tcPr>
+            <w:tcW w:type="dxa" w:w="4703"/>
+          </w:tcPr>
+          <w:p>
+            <w:r/>
+            <w:r>
+              <w:rPr>
+                <w:rFonts w:ascii="Calibri" w:hAnsi="Calibri"/>
+                <w:color w:val="1A1A2E"/>
+                <w:sz w:val="20"/>
+              </w:rPr>
+              <w:t>All styles (colors, fonts, layouts)</w:t>
+            </w:r>
+          </w:p>
+        </w:tc>
+      </w:tr>
+      <w:tr>
+        <w:tc>
+          <w:tcPr>
+            <w:tcW w:type="dxa" w:w="4703"/>
+            <w:shd w:fill="F8F6FF"/>
+          </w:tcPr>
+          <w:p>
+            <w:r/>
+            <w:r>
+              <w:rPr>
+                <w:rFonts w:ascii="Calibri" w:hAnsi="Calibri"/>
+                <w:color w:val="1A1A2E"/>
+                <w:sz w:val="20"/>
+              </w:rPr>
+              <w:t>js/shared.js</w:t>
+            </w:r>
+          </w:p>
+        </w:tc>
+        <w:tc>
+          <w:tcPr>
+            <w:tcW w:type="dxa" w:w="4703"/>
+            <w:shd w:fill="F8F6FF"/>
+          </w:tcPr>
+          <w:p>
+            <w:r/>
+            <w:r>
+              <w:rPr>
+                <w:rFonts w:ascii="Calibri" w:hAnsi="Calibri"/>
+                <w:color w:val="1A1A2E"/>
+                <w:sz w:val="20"/>
+              </w:rPr>
+              <w:t>Animations, navbar, video modal</w:t>
+            </w:r>
+          </w:p>
+        </w:tc>
+      </w:tr>
+      <w:tr>
+        <w:tc>
+          <w:tcPr>
+            <w:tcW w:type="dxa" w:w="4703"/>
+          </w:tcPr>
+          <w:p>
+            <w:r/>
+            <w:r>
+              <w:rPr>
+                <w:rFonts w:ascii="Calibri" w:hAnsi="Calibri"/>
+                <w:color w:val="1A1A2E"/>
+                <w:sz w:val="20"/>
+              </w:rPr>
+              <w:t>images/</w:t>
+            </w:r>
+          </w:p>
+        </w:tc>
+        <w:tc>
+          <w:tcPr>
+            <w:tcW w:type="dxa" w:w="4703"/>
+          </w:tcPr>
+          <w:p>
+            <w:r/>
+            <w:r>
+              <w:rPr>
+                <w:rFonts w:ascii="Calibri" w:hAnsi="Calibri"/>
+                <w:color w:val="1A1A2E"/>
+                <w:sz w:val="20"/>
+              </w:rPr>
+              <w:t>All image files</w:t>
+            </w:r>
+          </w:p>
+        </w:tc>
+      </w:tr>
+      <w:tr>
+        <w:tc>
+          <w:tcPr>
+            <w:tcW w:type="dxa" w:w="4703"/>
+            <w:shd w:fill="F8F6FF"/>
+          </w:tcPr>
+          <w:p>
+            <w:r/>
+            <w:r>
+              <w:rPr>
+                <w:rFonts w:ascii="Calibri" w:hAnsi="Calibri"/>
+                <w:color w:val="1A1A2E"/>
+                <w:sz w:val="20"/>
+              </w:rPr>
+              <w:t>videos/</w:t>
+            </w:r>
+          </w:p>
+        </w:tc>
+        <w:tc>
+          <w:tcPr>
+            <w:tcW w:type="dxa" w:w="4703"/>
+            <w:shd w:fill="F8F6FF"/>
+          </w:tcPr>
+          <w:p>
+            <w:r/>
+            <w:r>
+              <w:rPr>
+                <w:rFonts w:ascii="Calibri" w:hAnsi="Calibri"/>
+                <w:color w:val="1A1A2E"/>
+                <w:sz w:val="20"/>
+              </w:rPr>
+              <w:t>All video files</w:t>
             </w:r>
           </w:p>
         </w:tc>
@@ -350,442 +1127,2298 @@
     <w:p/>
     <w:p>
       <w:pPr>
-        <w:pStyle w:val="Heading1"/>
-      </w:pPr>
+        <w:spacing w:before="0" w:after="160"/>
+      </w:pPr>
+    </w:p>
+    <w:p>
       <w:r>
-        <w:t>3. How to Change Text on the Website</w:t>
+        <w:rPr>
+          <w:rFonts w:ascii="Georgia" w:hAnsi="Georgia"/>
+          <w:b/>
+          <w:color w:val="7C3AED"/>
+          <w:sz w:val="56"/>
+        </w:rPr>
+        <w:t xml:space="preserve">03  </w:t>
+      </w:r>
+      <w:r>
+        <w:rPr>
+          <w:rFonts w:ascii="Calibri" w:hAnsi="Calibri"/>
+          <w:b/>
+          <w:color w:val="1A1A2E"/>
+          <w:sz w:val="28"/>
+        </w:rPr>
+        <w:t>HOW TO CHANGE TEXT</w:t>
       </w:r>
     </w:p>
     <w:p>
       <w:r>
-        <w:t>Step 1: Open the file you want to edit (like index.html) in any text editor.</w:t>
+        <w:rPr>
+          <w:color w:val="A78BFA"/>
+          <w:sz w:val="12"/>
+        </w:rPr>
+        <w:t>________________________________________________________________________</w:t>
       </w:r>
     </w:p>
     <w:p>
+      <w:pPr>
+        <w:spacing w:before="0" w:after="120"/>
+      </w:pPr>
+    </w:p>
+    <w:p>
+      <w:pPr>
+        <w:spacing w:after="120" w:line="312" w:lineRule="auto"/>
+      </w:pPr>
       <w:r>
-        <w:t>Step 2: Find the text you want to change.</w:t>
+        <w:rPr>
+          <w:rFonts w:ascii="Georgia" w:hAnsi="Georgia"/>
+          <w:b/>
+          <w:color w:val="7C3AED"/>
+          <w:sz w:val="24"/>
+        </w:rPr>
+        <w:t xml:space="preserve">  1  </w:t>
+      </w:r>
+      <w:r>
+        <w:rPr>
+          <w:rFonts w:ascii="Calibri" w:hAnsi="Calibri"/>
+          <w:color w:val="1A1A2E"/>
+          <w:sz w:val="22"/>
+        </w:rPr>
+        <w:t>Open the file you want to edit (like index.html) in any text editor.</w:t>
       </w:r>
     </w:p>
     <w:p>
+      <w:pPr>
+        <w:spacing w:after="120" w:line="312" w:lineRule="auto"/>
+      </w:pPr>
       <w:r>
-        <w:t>Step 3: Change the text between the &gt; and &lt; symbols.</w:t>
+        <w:rPr>
+          <w:rFonts w:ascii="Georgia" w:hAnsi="Georgia"/>
+          <w:b/>
+          <w:color w:val="7C3AED"/>
+          <w:sz w:val="24"/>
+        </w:rPr>
+        <w:t xml:space="preserve">  2  </w:t>
+      </w:r>
+      <w:r>
+        <w:rPr>
+          <w:rFonts w:ascii="Calibri" w:hAnsi="Calibri"/>
+          <w:color w:val="1A1A2E"/>
+          <w:sz w:val="22"/>
+        </w:rPr>
+        <w:t>Find the text you want to change.</w:t>
       </w:r>
     </w:p>
-    <w:p/>
     <w:p>
+      <w:pPr>
+        <w:spacing w:after="120" w:line="312" w:lineRule="auto"/>
+      </w:pPr>
       <w:r>
         <w:rPr>
+          <w:rFonts w:ascii="Georgia" w:hAnsi="Georgia"/>
           <w:b/>
+          <w:color w:val="7C3AED"/>
+          <w:sz w:val="24"/>
+        </w:rPr>
+        <w:t xml:space="preserve">  3  </w:t>
+      </w:r>
+      <w:r>
+        <w:rPr>
+          <w:rFonts w:ascii="Calibri" w:hAnsi="Calibri"/>
+          <w:color w:val="1A1A2E"/>
+          <w:sz w:val="22"/>
+        </w:rPr>
+        <w:t>Change the text between the &gt; and &lt; symbols.</w:t>
+      </w:r>
+    </w:p>
+    <w:p>
+      <w:pPr>
+        <w:spacing w:after="120" w:line="312" w:lineRule="auto"/>
+      </w:pPr>
+      <w:r>
+        <w:rPr>
+          <w:rFonts w:ascii="Georgia" w:hAnsi="Georgia"/>
+          <w:b/>
+          <w:color w:val="7C3AED"/>
+          <w:sz w:val="24"/>
+        </w:rPr>
+        <w:t xml:space="preserve">  4  </w:t>
+      </w:r>
+      <w:r>
+        <w:rPr>
+          <w:rFonts w:ascii="Calibri" w:hAnsi="Calibri"/>
+          <w:color w:val="1A1A2E"/>
+          <w:sz w:val="22"/>
+        </w:rPr>
+        <w:t>Save the file and deploy (see Section 06).</w:t>
+      </w:r>
+    </w:p>
+    <w:p>
+      <w:pPr>
+        <w:spacing w:before="0" w:after="80"/>
+      </w:pPr>
+    </w:p>
+    <w:p>
+      <w:pPr>
+        <w:spacing w:after="80" w:line="312" w:lineRule="auto"/>
+      </w:pPr>
+      <w:r>
+        <w:rPr>
+          <w:rFonts w:ascii="Calibri" w:hAnsi="Calibri"/>
+          <w:b/>
+          <w:i w:val="0"/>
+          <w:sz w:val="22"/>
         </w:rPr>
         <w:t>Example:</w:t>
       </w:r>
     </w:p>
     <w:p>
+      <w:pPr>
+        <w:spacing w:after="80" w:line="312" w:lineRule="auto"/>
+      </w:pPr>
       <w:r>
-        <w:t>To change the homepage hero text, open index.html and find:</w:t>
+        <w:rPr>
+          <w:rFonts w:ascii="Calibri" w:hAnsi="Calibri"/>
+          <w:b w:val="0"/>
+          <w:i w:val="0"/>
+          <w:sz w:val="22"/>
+        </w:rPr>
+        <w:t>To change the homepage subtitle, find this line in index.html:</w:t>
       </w:r>
     </w:p>
     <w:p>
+      <w:pPr>
+        <w:shd w:fill="F0EDFA" w:val="clear"/>
+        <w:spacing w:before="160" w:after="160"/>
+      </w:pPr>
       <w:r>
         <w:rPr>
-          <w:rFonts w:ascii="Courier New" w:hAnsi="Courier New"/>
+          <w:rFonts w:ascii="Consolas" w:hAnsi="Consolas"/>
+          <w:b/>
+          <w:color w:val="7C3AED"/>
           <w:sz w:val="20"/>
         </w:rPr>
         <w:t>&lt;div class="hero-subtitle"&gt;We build brands that break through&lt;/div&gt;</w:t>
       </w:r>
     </w:p>
     <w:p>
+      <w:pPr>
+        <w:spacing w:after="80" w:line="312" w:lineRule="auto"/>
+      </w:pPr>
       <w:r>
+        <w:rPr>
+          <w:rFonts w:ascii="Calibri" w:hAnsi="Calibri"/>
+          <w:b w:val="0"/>
+          <w:i w:val="0"/>
+          <w:sz w:val="22"/>
+        </w:rPr>
         <w:t>Change the words between &gt; and &lt; to your new text:</w:t>
+      </w:r>
+    </w:p>
+    <w:p>
+      <w:pPr>
+        <w:shd w:fill="F0EDFA" w:val="clear"/>
+        <w:spacing w:before="160" w:after="160"/>
+      </w:pPr>
+      <w:r>
+        <w:rPr>
+          <w:rFonts w:ascii="Consolas" w:hAnsi="Consolas"/>
+          <w:b/>
+          <w:color w:val="7C3AED"/>
+          <w:sz w:val="20"/>
+        </w:rPr>
+        <w:t>&lt;div class="hero-subtitle"&gt;Your new text goes here!&lt;/div&gt;</w:t>
+      </w:r>
+    </w:p>
+    <w:p>
+      <w:pPr>
+        <w:shd w:fill="F5F0FF" w:val="clear"/>
+        <w:spacing w:before="120" w:after="120"/>
+      </w:pPr>
+      <w:r>
+        <w:rPr>
+          <w:rFonts w:ascii="Calibri" w:hAnsi="Calibri"/>
+          <w:b/>
+          <w:color w:val="FFFFFF"/>
+          <w:sz w:val="18"/>
+        </w:rPr>
+        <w:t xml:space="preserve">  TIP  </w:t>
+      </w:r>
+      <w:r>
+        <w:rPr>
+          <w:rFonts w:ascii="Calibri" w:hAnsi="Calibri"/>
+          <w:i/>
+          <w:color w:val="7C3AED"/>
+          <w:sz w:val="20"/>
+        </w:rPr>
+        <w:t xml:space="preserve">  Or just ask Claude: "Change the homepage subtitle to [your new text]"</w:t>
+      </w:r>
+    </w:p>
+    <w:p>
+      <w:pPr>
+        <w:spacing w:before="0" w:after="160"/>
+      </w:pPr>
+    </w:p>
+    <w:p>
+      <w:r>
+        <w:rPr>
+          <w:rFonts w:ascii="Georgia" w:hAnsi="Georgia"/>
+          <w:b/>
+          <w:color w:val="7C3AED"/>
+          <w:sz w:val="56"/>
+        </w:rPr>
+        <w:t xml:space="preserve">04  </w:t>
+      </w:r>
+      <w:r>
+        <w:rPr>
+          <w:rFonts w:ascii="Calibri" w:hAnsi="Calibri"/>
+          <w:b/>
+          <w:color w:val="1A1A2E"/>
+          <w:sz w:val="28"/>
+        </w:rPr>
+        <w:t>HOW TO CHANGE IMAGES</w:t>
       </w:r>
     </w:p>
     <w:p>
       <w:r>
         <w:rPr>
-          <w:rFonts w:ascii="Courier New" w:hAnsi="Courier New"/>
-          <w:sz w:val="20"/>
+          <w:color w:val="A78BFA"/>
+          <w:sz w:val="12"/>
         </w:rPr>
-        <w:t>&lt;div class="hero-subtitle"&gt;Your new text goes here!&lt;/div&gt;</w:t>
-      </w:r>
-    </w:p>
-    <w:p/>
-    <w:p>
-      <w:pPr>
-        <w:pStyle w:val="Heading1"/>
-      </w:pPr>
-      <w:r>
-        <w:t>4. How to Change an Image</w:t>
+        <w:t>________________________________________________________________________</w:t>
       </w:r>
     </w:p>
     <w:p>
+      <w:pPr>
+        <w:spacing w:before="0" w:after="120"/>
+      </w:pPr>
+    </w:p>
+    <w:p>
+      <w:pPr>
+        <w:spacing w:after="120" w:line="312" w:lineRule="auto"/>
+      </w:pPr>
       <w:r>
-        <w:t>Step 1: Put your new image in the images/ folder (or images/work/ for project images).</w:t>
+        <w:rPr>
+          <w:rFonts w:ascii="Georgia" w:hAnsi="Georgia"/>
+          <w:b/>
+          <w:color w:val="7C3AED"/>
+          <w:sz w:val="24"/>
+        </w:rPr>
+        <w:t xml:space="preserve">  1  </w:t>
+      </w:r>
+      <w:r>
+        <w:rPr>
+          <w:rFonts w:ascii="Calibri" w:hAnsi="Calibri"/>
+          <w:color w:val="1A1A2E"/>
+          <w:sz w:val="22"/>
+        </w:rPr>
+        <w:t>Put your new image in the images/ folder (or images/work/ for project images).</w:t>
       </w:r>
     </w:p>
     <w:p>
+      <w:pPr>
+        <w:spacing w:after="120" w:line="312" w:lineRule="auto"/>
+      </w:pPr>
       <w:r>
-        <w:t>Step 2: Open the HTML file and find the old image name.</w:t>
+        <w:rPr>
+          <w:rFonts w:ascii="Georgia" w:hAnsi="Georgia"/>
+          <w:b/>
+          <w:color w:val="7C3AED"/>
+          <w:sz w:val="24"/>
+        </w:rPr>
+        <w:t xml:space="preserve">  2  </w:t>
+      </w:r>
+      <w:r>
+        <w:rPr>
+          <w:rFonts w:ascii="Calibri" w:hAnsi="Calibri"/>
+          <w:color w:val="1A1A2E"/>
+          <w:sz w:val="22"/>
+        </w:rPr>
+        <w:t>Open the HTML file and find the old image name.</w:t>
       </w:r>
     </w:p>
     <w:p>
+      <w:pPr>
+        <w:spacing w:after="120" w:line="312" w:lineRule="auto"/>
+      </w:pPr>
       <w:r>
-        <w:t>Step 3: Replace the old image name with your new one.</w:t>
+        <w:rPr>
+          <w:rFonts w:ascii="Georgia" w:hAnsi="Georgia"/>
+          <w:b/>
+          <w:color w:val="7C3AED"/>
+          <w:sz w:val="24"/>
+        </w:rPr>
+        <w:t xml:space="preserve">  3  </w:t>
+      </w:r>
+      <w:r>
+        <w:rPr>
+          <w:rFonts w:ascii="Calibri" w:hAnsi="Calibri"/>
+          <w:color w:val="1A1A2E"/>
+          <w:sz w:val="22"/>
+        </w:rPr>
+        <w:t>Replace the old image name with your new one.</w:t>
       </w:r>
     </w:p>
-    <w:p/>
     <w:p>
+      <w:pPr>
+        <w:spacing w:before="0" w:after="80"/>
+      </w:pPr>
+    </w:p>
+    <w:p>
+      <w:pPr>
+        <w:spacing w:after="80" w:line="312" w:lineRule="auto"/>
+      </w:pPr>
       <w:r>
         <w:rPr>
+          <w:rFonts w:ascii="Calibri" w:hAnsi="Calibri"/>
           <w:b/>
+          <w:i w:val="0"/>
+          <w:sz w:val="22"/>
         </w:rPr>
         <w:t>Example:</w:t>
       </w:r>
     </w:p>
     <w:p>
+      <w:pPr>
+        <w:spacing w:after="80" w:line="312" w:lineRule="auto"/>
+      </w:pPr>
       <w:r>
+        <w:rPr>
+          <w:rFonts w:ascii="Calibri" w:hAnsi="Calibri"/>
+          <w:b w:val="0"/>
+          <w:i w:val="0"/>
+          <w:sz w:val="22"/>
+        </w:rPr>
         <w:t>Change this:</w:t>
       </w:r>
     </w:p>
     <w:p>
+      <w:pPr>
+        <w:shd w:fill="F0EDFA" w:val="clear"/>
+        <w:spacing w:before="160" w:after="160"/>
+      </w:pPr>
       <w:r>
         <w:rPr>
-          <w:rFonts w:ascii="Courier New" w:hAnsi="Courier New"/>
+          <w:rFonts w:ascii="Consolas" w:hAnsi="Consolas"/>
+          <w:b/>
+          <w:color w:val="7C3AED"/>
           <w:sz w:val="20"/>
         </w:rPr>
         <w:t>src="images/work/old-photo.jpg"</w:t>
       </w:r>
     </w:p>
     <w:p>
+      <w:pPr>
+        <w:spacing w:after="80" w:line="312" w:lineRule="auto"/>
+      </w:pPr>
       <w:r>
+        <w:rPr>
+          <w:rFonts w:ascii="Calibri" w:hAnsi="Calibri"/>
+          <w:b w:val="0"/>
+          <w:i w:val="0"/>
+          <w:sz w:val="22"/>
+        </w:rPr>
         <w:t>To this:</w:t>
+      </w:r>
+    </w:p>
+    <w:p>
+      <w:pPr>
+        <w:shd w:fill="F0EDFA" w:val="clear"/>
+        <w:spacing w:before="160" w:after="160"/>
+      </w:pPr>
+      <w:r>
+        <w:rPr>
+          <w:rFonts w:ascii="Consolas" w:hAnsi="Consolas"/>
+          <w:b/>
+          <w:color w:val="7C3AED"/>
+          <w:sz w:val="20"/>
+        </w:rPr>
+        <w:t>src="images/work/new-photo.jpg"</w:t>
+      </w:r>
+    </w:p>
+    <w:p>
+      <w:pPr>
+        <w:spacing w:before="0" w:after="160"/>
+      </w:pPr>
+    </w:p>
+    <w:p>
+      <w:r>
+        <w:rPr>
+          <w:rFonts w:ascii="Georgia" w:hAnsi="Georgia"/>
+          <w:b/>
+          <w:color w:val="7C3AED"/>
+          <w:sz w:val="56"/>
+        </w:rPr>
+        <w:t xml:space="preserve">05  </w:t>
+      </w:r>
+      <w:r>
+        <w:rPr>
+          <w:rFonts w:ascii="Calibri" w:hAnsi="Calibri"/>
+          <w:b/>
+          <w:color w:val="1A1A2E"/>
+          <w:sz w:val="28"/>
+        </w:rPr>
+        <w:t>HOW TO CHANGE THE YOUTUBE VIDEO</w:t>
       </w:r>
     </w:p>
     <w:p>
       <w:r>
         <w:rPr>
-          <w:rFonts w:ascii="Courier New" w:hAnsi="Courier New"/>
-          <w:sz w:val="20"/>
+          <w:color w:val="A78BFA"/>
+          <w:sz w:val="12"/>
         </w:rPr>
-        <w:t>src="images/work/new-photo.jpg"</w:t>
-      </w:r>
-    </w:p>
-    <w:p/>
-    <w:p>
-      <w:pPr>
-        <w:pStyle w:val="Heading1"/>
-      </w:pPr>
-      <w:r>
-        <w:t>5. How to Change the YouTube Video</w:t>
+        <w:t>________________________________________________________________________</w:t>
       </w:r>
     </w:p>
     <w:p>
+      <w:pPr>
+        <w:spacing w:before="0" w:after="120"/>
+      </w:pPr>
+    </w:p>
+    <w:p>
+      <w:pPr>
+        <w:spacing w:after="80" w:line="312" w:lineRule="auto"/>
+      </w:pPr>
       <w:r>
-        <w:t>The "Watch Episode 1" button plays a YouTube video.</w:t>
-      </w:r>
-    </w:p>
-    <w:p/>
-    <w:p>
-      <w:r>
-        <w:t>Step 1: Open js/shared.js</w:t>
+        <w:rPr>
+          <w:rFonts w:ascii="Calibri" w:hAnsi="Calibri"/>
+          <w:b w:val="0"/>
+          <w:i w:val="0"/>
+          <w:sz w:val="22"/>
+        </w:rPr>
+        <w:t>The "Watch Episode 1" button on the homepage plays a YouTube video.</w:t>
       </w:r>
     </w:p>
     <w:p>
+      <w:pPr>
+        <w:spacing w:before="0" w:after="80"/>
+      </w:pPr>
+    </w:p>
+    <w:p>
+      <w:pPr>
+        <w:spacing w:after="120" w:line="312" w:lineRule="auto"/>
+      </w:pPr>
       <w:r>
-        <w:t>Step 2: Find this line (near the top):</w:t>
+        <w:rPr>
+          <w:rFonts w:ascii="Georgia" w:hAnsi="Georgia"/>
+          <w:b/>
+          <w:color w:val="7C3AED"/>
+          <w:sz w:val="24"/>
+        </w:rPr>
+        <w:t xml:space="preserve">  1  </w:t>
+      </w:r>
+      <w:r>
+        <w:rPr>
+          <w:rFonts w:ascii="Calibri" w:hAnsi="Calibri"/>
+          <w:color w:val="1A1A2E"/>
+          <w:sz w:val="22"/>
+        </w:rPr>
+        <w:t>Open the file js/shared.js</w:t>
+      </w:r>
+    </w:p>
+    <w:p>
+      <w:pPr>
+        <w:spacing w:after="120" w:line="312" w:lineRule="auto"/>
+      </w:pPr>
+      <w:r>
+        <w:rPr>
+          <w:rFonts w:ascii="Georgia" w:hAnsi="Georgia"/>
+          <w:b/>
+          <w:color w:val="7C3AED"/>
+          <w:sz w:val="24"/>
+        </w:rPr>
+        <w:t xml:space="preserve">  2  </w:t>
+      </w:r>
+      <w:r>
+        <w:rPr>
+          <w:rFonts w:ascii="Calibri" w:hAnsi="Calibri"/>
+          <w:color w:val="1A1A2E"/>
+          <w:sz w:val="22"/>
+        </w:rPr>
+        <w:t>Find the YouTube embed line near the top of the file.</w:t>
+      </w:r>
+    </w:p>
+    <w:p>
+      <w:pPr>
+        <w:spacing w:after="120" w:line="312" w:lineRule="auto"/>
+      </w:pPr>
+      <w:r>
+        <w:rPr>
+          <w:rFonts w:ascii="Georgia" w:hAnsi="Georgia"/>
+          <w:b/>
+          <w:color w:val="7C3AED"/>
+          <w:sz w:val="24"/>
+        </w:rPr>
+        <w:t xml:space="preserve">  3  </w:t>
+      </w:r>
+      <w:r>
+        <w:rPr>
+          <w:rFonts w:ascii="Calibri" w:hAnsi="Calibri"/>
+          <w:color w:val="1A1A2E"/>
+          <w:sz w:val="22"/>
+        </w:rPr>
+        <w:t>Replace the video ID (the letters/numbers after /embed/) with your new video ID.</w:t>
+      </w:r>
+    </w:p>
+    <w:p>
+      <w:pPr>
+        <w:spacing w:before="0" w:after="80"/>
+      </w:pPr>
+    </w:p>
+    <w:p>
+      <w:pPr>
+        <w:spacing w:after="80" w:line="312" w:lineRule="auto"/>
+      </w:pPr>
+      <w:r>
+        <w:rPr>
+          <w:rFonts w:ascii="Calibri" w:hAnsi="Calibri"/>
+          <w:b/>
+          <w:i w:val="0"/>
+          <w:sz w:val="22"/>
+        </w:rPr>
+        <w:t>How to find a YouTube video ID:</w:t>
+      </w:r>
+    </w:p>
+    <w:p>
+      <w:pPr>
+        <w:pStyle w:val="ListBullet"/>
+        <w:spacing w:after="60" w:line="312" w:lineRule="auto"/>
+      </w:pPr>
+      <w:r>
+        <w:rPr>
+          <w:rFonts w:ascii="Calibri" w:hAnsi="Calibri"/>
+          <w:color w:val="1A1A2E"/>
+          <w:sz w:val="22"/>
+        </w:rPr>
+        <w:t>If the link is https://youtu.be/ABC123XYZ  then the ID is ABC123XYZ</w:t>
+      </w:r>
+    </w:p>
+    <w:p>
+      <w:pPr>
+        <w:pStyle w:val="ListBullet"/>
+        <w:spacing w:after="60" w:line="312" w:lineRule="auto"/>
+      </w:pPr>
+      <w:r>
+        <w:rPr>
+          <w:rFonts w:ascii="Calibri" w:hAnsi="Calibri"/>
+          <w:color w:val="1A1A2E"/>
+          <w:sz w:val="22"/>
+        </w:rPr>
+        <w:t>If the link is https://youtube.com/watch?v=ABC123XYZ  then the ID is ABC123XYZ</w:t>
+      </w:r>
+    </w:p>
+    <w:p>
+      <w:pPr>
+        <w:spacing w:before="0" w:after="160"/>
+      </w:pPr>
+    </w:p>
+    <w:p>
+      <w:r>
+        <w:rPr>
+          <w:rFonts w:ascii="Georgia" w:hAnsi="Georgia"/>
+          <w:b/>
+          <w:color w:val="7C3AED"/>
+          <w:sz w:val="56"/>
+        </w:rPr>
+        <w:t xml:space="preserve">06  </w:t>
+      </w:r>
+      <w:r>
+        <w:rPr>
+          <w:rFonts w:ascii="Calibri" w:hAnsi="Calibri"/>
+          <w:b/>
+          <w:color w:val="1A1A2E"/>
+          <w:sz w:val="28"/>
+        </w:rPr>
+        <w:t>HOW TO PUSH CHANGES LIVE</w:t>
       </w:r>
     </w:p>
     <w:p>
       <w:r>
         <w:rPr>
-          <w:rFonts w:ascii="Courier New" w:hAnsi="Courier New"/>
+          <w:color w:val="A78BFA"/>
+          <w:sz w:val="12"/>
+        </w:rPr>
+        <w:t>________________________________________________________________________</w:t>
+      </w:r>
+    </w:p>
+    <w:p>
+      <w:pPr>
+        <w:spacing w:before="0" w:after="120"/>
+      </w:pPr>
+    </w:p>
+    <w:p>
+      <w:r>
+        <w:rPr>
+          <w:rFonts w:ascii="Calibri" w:hAnsi="Calibri"/>
+          <w:b/>
+          <w:color w:val="7C3AED"/>
+          <w:sz w:val="24"/>
+        </w:rPr>
+        <w:t>This is the most important section!</w:t>
+      </w:r>
+    </w:p>
+    <w:p>
+      <w:pPr>
+        <w:spacing w:after="80" w:line="312" w:lineRule="auto"/>
+      </w:pPr>
+      <w:r>
+        <w:rPr>
+          <w:rFonts w:ascii="Calibri" w:hAnsi="Calibri"/>
+          <w:b w:val="0"/>
+          <w:i w:val="0"/>
+          <w:sz w:val="22"/>
+        </w:rPr>
+        <w:t>After you edit a file, the changes are only on your computer. You need to push them live to the internet.</w:t>
+      </w:r>
+    </w:p>
+    <w:p>
+      <w:pPr>
+        <w:spacing w:before="0" w:after="80"/>
+      </w:pPr>
+    </w:p>
+    <w:p>
+      <w:pPr>
+        <w:spacing w:after="120" w:line="312" w:lineRule="auto"/>
+      </w:pPr>
+      <w:r>
+        <w:rPr>
+          <w:rFonts w:ascii="Georgia" w:hAnsi="Georgia"/>
+          <w:b/>
+          <w:color w:val="7C3AED"/>
+          <w:sz w:val="24"/>
+        </w:rPr>
+        <w:t xml:space="preserve">  1  </w:t>
+      </w:r>
+      <w:r>
+        <w:rPr>
+          <w:rFonts w:ascii="Calibri" w:hAnsi="Calibri"/>
+          <w:color w:val="1A1A2E"/>
+          <w:sz w:val="22"/>
+        </w:rPr>
+        <w:t>Open the Terminal app on your Mac.</w:t>
+      </w:r>
+    </w:p>
+    <w:p>
+      <w:pPr>
+        <w:spacing w:after="120" w:line="312" w:lineRule="auto"/>
+      </w:pPr>
+      <w:r>
+        <w:rPr>
+          <w:rFonts w:ascii="Georgia" w:hAnsi="Georgia"/>
+          <w:b/>
+          <w:color w:val="7C3AED"/>
+          <w:sz w:val="24"/>
+        </w:rPr>
+        <w:t xml:space="preserve">  2  </w:t>
+      </w:r>
+      <w:r>
+        <w:rPr>
+          <w:rFonts w:ascii="Calibri" w:hAnsi="Calibri"/>
+          <w:color w:val="1A1A2E"/>
+          <w:sz w:val="22"/>
+        </w:rPr>
+        <w:t>Copy and paste this entire command, then press Enter:</w:t>
+      </w:r>
+    </w:p>
+    <w:p>
+      <w:pPr>
+        <w:spacing w:before="0" w:after="40"/>
+      </w:pPr>
+    </w:p>
+    <w:p>
+      <w:pPr>
+        <w:shd w:fill="F0EDFA" w:val="clear"/>
+        <w:spacing w:before="160" w:after="160"/>
+      </w:pPr>
+      <w:r>
+        <w:rPr>
+          <w:rFonts w:ascii="Consolas" w:hAnsi="Consolas"/>
+          <w:b/>
+          <w:color w:val="7C3AED"/>
+          <w:sz w:val="20"/>
+        </w:rPr>
+        <w:t>cd ~/Desktop/driven-creations-webflow &amp;&amp; git add -A &amp;&amp; git commit -m "Update site" &amp;&amp; git push &amp;&amp; npx vercel --prod --yes --scope derricks-projects-85a0451e</w:t>
+      </w:r>
+    </w:p>
+    <w:p>
+      <w:pPr>
+        <w:spacing w:before="0" w:after="40"/>
+      </w:pPr>
+    </w:p>
+    <w:p>
+      <w:pPr>
+        <w:spacing w:after="120" w:line="312" w:lineRule="auto"/>
+      </w:pPr>
+      <w:r>
+        <w:rPr>
+          <w:rFonts w:ascii="Georgia" w:hAnsi="Georgia"/>
+          <w:b/>
+          <w:color w:val="7C3AED"/>
+          <w:sz w:val="24"/>
+        </w:rPr>
+        <w:t xml:space="preserve">  3  </w:t>
+      </w:r>
+      <w:r>
+        <w:rPr>
+          <w:rFonts w:ascii="Calibri" w:hAnsi="Calibri"/>
+          <w:color w:val="1A1A2E"/>
+          <w:sz w:val="22"/>
+        </w:rPr>
+        <w:t>Wait about 20 seconds for it to finish.</w:t>
+      </w:r>
+    </w:p>
+    <w:p>
+      <w:pPr>
+        <w:spacing w:after="120" w:line="312" w:lineRule="auto"/>
+      </w:pPr>
+      <w:r>
+        <w:rPr>
+          <w:rFonts w:ascii="Georgia" w:hAnsi="Georgia"/>
+          <w:b/>
+          <w:color w:val="7C3AED"/>
+          <w:sz w:val="24"/>
+        </w:rPr>
+        <w:t xml:space="preserve">  4  </w:t>
+      </w:r>
+      <w:r>
+        <w:rPr>
+          <w:rFonts w:ascii="Calibri" w:hAnsi="Calibri"/>
+          <w:color w:val="1A1A2E"/>
+          <w:sz w:val="22"/>
+        </w:rPr>
+        <w:t>Visit drivencreations.com to see your changes!</w:t>
+      </w:r>
+    </w:p>
+    <w:p>
+      <w:pPr>
+        <w:spacing w:before="0" w:after="120"/>
+      </w:pPr>
+    </w:p>
+    <w:p>
+      <w:pPr>
+        <w:spacing w:after="80" w:line="312" w:lineRule="auto"/>
+      </w:pPr>
+      <w:r>
+        <w:rPr>
+          <w:rFonts w:ascii="Calibri" w:hAnsi="Calibri"/>
+          <w:b/>
+          <w:i w:val="0"/>
+          <w:sz w:val="22"/>
+        </w:rPr>
+        <w:t>What that command does:</w:t>
+      </w:r>
+    </w:p>
+    <w:p>
+      <w:pPr>
+        <w:pStyle w:val="ListBullet"/>
+        <w:spacing w:after="60" w:line="312" w:lineRule="auto"/>
+      </w:pPr>
+      <w:r>
+        <w:rPr>
+          <w:rFonts w:ascii="Calibri" w:hAnsi="Calibri"/>
+          <w:color w:val="1A1A2E"/>
+          <w:sz w:val="22"/>
+        </w:rPr>
+        <w:t>Saves your changes to GitHub (a backup of your code)</w:t>
+      </w:r>
+    </w:p>
+    <w:p>
+      <w:pPr>
+        <w:pStyle w:val="ListBullet"/>
+        <w:spacing w:after="60" w:line="312" w:lineRule="auto"/>
+      </w:pPr>
+      <w:r>
+        <w:rPr>
+          <w:rFonts w:ascii="Calibri" w:hAnsi="Calibri"/>
+          <w:color w:val="1A1A2E"/>
+          <w:sz w:val="22"/>
+        </w:rPr>
+        <w:t>Pushes them to Vercel (your website host)</w:t>
+      </w:r>
+    </w:p>
+    <w:p>
+      <w:pPr>
+        <w:pStyle w:val="ListBullet"/>
+        <w:spacing w:after="60" w:line="312" w:lineRule="auto"/>
+      </w:pPr>
+      <w:r>
+        <w:rPr>
+          <w:rFonts w:ascii="Calibri" w:hAnsi="Calibri"/>
+          <w:color w:val="1A1A2E"/>
+          <w:sz w:val="22"/>
+        </w:rPr>
+        <w:t>Makes them live at drivencreations.com</w:t>
+      </w:r>
+    </w:p>
+    <w:p>
+      <w:pPr>
+        <w:shd w:fill="F5F0FF" w:val="clear"/>
+        <w:spacing w:before="120" w:after="120"/>
+      </w:pPr>
+      <w:r>
+        <w:rPr>
+          <w:rFonts w:ascii="Calibri" w:hAnsi="Calibri"/>
+          <w:b/>
+          <w:color w:val="FFFFFF"/>
           <w:sz w:val="18"/>
         </w:rPr>
-        <w:t>iframe.setAttribute('src', 'https://www.youtube.com/embed/im-qtaIxbYk...');</w:t>
+        <w:t xml:space="preserve">  TIP  </w:t>
+      </w:r>
+      <w:r>
+        <w:rPr>
+          <w:rFonts w:ascii="Calibri" w:hAnsi="Calibri"/>
+          <w:i/>
+          <w:color w:val="7C3AED"/>
+          <w:sz w:val="20"/>
+        </w:rPr>
+        <w:t xml:space="preserve">  If the site doesn't update, try a hard refresh: Cmd + Shift + R</w:t>
       </w:r>
     </w:p>
     <w:p>
       <w:r>
-        <w:t>Step 3: Replace im-qtaIxbYk with the new YouTube video ID.</w:t>
-      </w:r>
-    </w:p>
-    <w:p/>
-    <w:p>
-      <w:r>
-        <w:rPr>
-          <w:b/>
-        </w:rPr>
-        <w:t>How to find a YouTube video ID:</w:t>
-      </w:r>
-    </w:p>
-    <w:p>
-      <w:r>
-        <w:t>If the YouTube link is https://youtu.be/ABC123XYZ then the ID is ABC123XYZ</w:t>
-      </w:r>
-    </w:p>
-    <w:p>
-      <w:r>
-        <w:t>If the YouTube link is https://youtube.com/watch?v=ABC123XYZ then the ID is ABC123XYZ</w:t>
-      </w:r>
-    </w:p>
-    <w:p/>
-    <w:p>
-      <w:pPr>
-        <w:pStyle w:val="Heading1"/>
-      </w:pPr>
-      <w:r>
-        <w:t>6. How to Push Your Changes Live (MOST IMPORTANT!)</w:t>
+        <w:br w:type="page"/>
       </w:r>
     </w:p>
     <w:p>
       <w:r>
         <w:rPr>
+          <w:rFonts w:ascii="Georgia" w:hAnsi="Georgia"/>
           <w:b/>
+          <w:color w:val="7C3AED"/>
+          <w:sz w:val="56"/>
         </w:rPr>
-        <w:t>After you edit a file, your changes are only on your computer. You need to push them live!</w:t>
+        <w:t xml:space="preserve">07  </w:t>
       </w:r>
-    </w:p>
-    <w:p/>
-    <w:p>
-      <w:r>
-        <w:t>Step 1: Open the Terminal app on your Mac.</w:t>
-      </w:r>
-    </w:p>
-    <w:p>
-      <w:r>
-        <w:t>Step 2: Copy and paste this ENTIRE command and press Enter:</w:t>
-      </w:r>
-    </w:p>
-    <w:p/>
-    <w:p>
       <w:r>
         <w:rPr>
-          <w:rFonts w:ascii="Courier New" w:hAnsi="Courier New"/>
+          <w:rFonts w:ascii="Calibri" w:hAnsi="Calibri"/>
           <w:b/>
-          <w:sz w:val="18"/>
+          <w:color w:val="1A1A2E"/>
+          <w:sz w:val="28"/>
         </w:rPr>
-        <w:t>cd ~/Desktop/driven-creations-webflow &amp;&amp; git add -A &amp;&amp; git commit -m "Update site" &amp;&amp; git push &amp;&amp; npx vercel --prod --yes --scope derricks-projects-85a0451e</w:t>
-      </w:r>
-    </w:p>
-    <w:p/>
-    <w:p>
-      <w:r>
-        <w:t>Step 3: Wait about 20 seconds for it to finish.</w:t>
-      </w:r>
-    </w:p>
-    <w:p>
-      <w:r>
-        <w:t>Step 4: Check your website to see the changes!</w:t>
-      </w:r>
-    </w:p>
-    <w:p/>
-    <w:p>
-      <w:r>
-        <w:rPr>
-          <w:b/>
-        </w:rPr>
-        <w:t>What that command does:</w:t>
-      </w:r>
-    </w:p>
-    <w:p>
-      <w:r>
-        <w:t>• Saves your changes to GitHub (a backup)</w:t>
-      </w:r>
-    </w:p>
-    <w:p>
-      <w:r>
-        <w:t>• Pushes them to Vercel (your website host)</w:t>
-      </w:r>
-    </w:p>
-    <w:p>
-      <w:r>
-        <w:t>• Makes them live at drivencreations.com</w:t>
-      </w:r>
-    </w:p>
-    <w:p/>
-    <w:p>
-      <w:pPr>
-        <w:pStyle w:val="Heading1"/>
-      </w:pPr>
-      <w:r>
-        <w:t>7. The EASIEST Way: Just Ask Claude Code!</w:t>
+        <w:t>EDITING YOUR SITE WITH AI TOOLS</w:t>
       </w:r>
     </w:p>
     <w:p>
       <w:r>
         <w:rPr>
-          <w:b/>
+          <w:color w:val="A78BFA"/>
+          <w:sz w:val="12"/>
         </w:rPr>
-        <w:t>You don't even need to edit files yourself! Claude Code can do it all for you.</w:t>
+        <w:t>________________________________________________________________________</w:t>
       </w:r>
     </w:p>
-    <w:p/>
+    <w:p>
+      <w:pPr>
+        <w:spacing w:before="0" w:after="120"/>
+      </w:pPr>
+    </w:p>
     <w:p>
       <w:r>
-        <w:t>Step 1: Open Terminal</w:t>
+        <w:rPr>
+          <w:rFonts w:ascii="Georgia" w:hAnsi="Georgia"/>
+          <w:i/>
+          <w:color w:val="1A1A2E"/>
+          <w:sz w:val="28"/>
+        </w:rPr>
+        <w:t>You don't need to know how to code.</w:t>
+      </w:r>
+    </w:p>
+    <w:p>
+      <w:pPr>
+        <w:spacing w:before="0" w:after="80"/>
+      </w:pPr>
+    </w:p>
+    <w:p>
+      <w:pPr>
+        <w:spacing w:after="80" w:line="312" w:lineRule="auto"/>
+      </w:pPr>
+      <w:r>
+        <w:rPr>
+          <w:rFonts w:ascii="Calibri" w:hAnsi="Calibri"/>
+          <w:b w:val="0"/>
+          <w:i w:val="0"/>
+          <w:sz w:val="22"/>
+        </w:rPr>
+        <w:t>AI tools like Claude can make any change to your website just by you typing what you want in plain English. Here are three ways to do it, from easiest to most advanced.</w:t>
+      </w:r>
+    </w:p>
+    <w:p>
+      <w:pPr>
+        <w:spacing w:before="0" w:after="160"/>
+      </w:pPr>
+    </w:p>
+    <w:p>
+      <w:r>
+        <w:rPr>
+          <w:rFonts w:ascii="Georgia" w:hAnsi="Georgia"/>
+          <w:b/>
+          <w:color w:val="7C3AED"/>
+          <w:sz w:val="48"/>
+        </w:rPr>
+        <w:t>A</w:t>
+      </w:r>
+      <w:r>
+        <w:rPr>
+          <w:rFonts w:ascii="Calibri" w:hAnsi="Calibri"/>
+          <w:b/>
+          <w:color w:val="1A1A2E"/>
+          <w:sz w:val="26"/>
+        </w:rPr>
+        <w:t xml:space="preserve">   CLAUDE CODE IN TERMINAL</w:t>
       </w:r>
     </w:p>
     <w:p>
       <w:r>
-        <w:t>Step 2: Type claude and press Enter</w:t>
+        <w:rPr>
+          <w:color w:val="A78BFA"/>
+          <w:sz w:val="12"/>
+        </w:rPr>
+        <w:t>_______________________________________________</w:t>
+      </w:r>
+    </w:p>
+    <w:p>
+      <w:pPr>
+        <w:spacing w:before="0" w:after="40"/>
+      </w:pPr>
+    </w:p>
+    <w:p>
+      <w:pPr>
+        <w:shd w:fill="7C3AED" w:val="clear"/>
+      </w:pPr>
+      <w:r>
+        <w:rPr>
+          <w:rFonts w:ascii="Calibri" w:hAnsi="Calibri"/>
+          <w:b/>
+          <w:color w:val="FFFFFF"/>
+          <w:sz w:val="18"/>
+        </w:rPr>
+        <w:t>RECOMMENDED</w:t>
+      </w:r>
+    </w:p>
+    <w:p>
+      <w:pPr>
+        <w:spacing w:before="0" w:after="80"/>
+      </w:pPr>
+    </w:p>
+    <w:p>
+      <w:pPr>
+        <w:spacing w:after="80" w:line="312" w:lineRule="auto"/>
+      </w:pPr>
+      <w:r>
+        <w:rPr>
+          <w:rFonts w:ascii="Calibri" w:hAnsi="Calibri"/>
+          <w:b w:val="0"/>
+          <w:i w:val="0"/>
+          <w:sz w:val="22"/>
+        </w:rPr>
+        <w:t>The fastest way. Claude runs right in your Terminal and can edit files, save to GitHub, and deploy — all by itself.</w:t>
+      </w:r>
+    </w:p>
+    <w:p>
+      <w:pPr>
+        <w:spacing w:before="0" w:after="80"/>
+      </w:pPr>
+    </w:p>
+    <w:p>
+      <w:pPr>
+        <w:spacing w:after="80" w:line="312" w:lineRule="auto"/>
+      </w:pPr>
+      <w:r>
+        <w:rPr>
+          <w:rFonts w:ascii="Calibri" w:hAnsi="Calibri"/>
+          <w:b/>
+          <w:i w:val="0"/>
+          <w:sz w:val="22"/>
+        </w:rPr>
+        <w:t>How to start:</w:t>
+      </w:r>
+    </w:p>
+    <w:p>
+      <w:pPr>
+        <w:spacing w:after="120" w:line="312" w:lineRule="auto"/>
+      </w:pPr>
+      <w:r>
+        <w:rPr>
+          <w:rFonts w:ascii="Georgia" w:hAnsi="Georgia"/>
+          <w:b/>
+          <w:color w:val="7C3AED"/>
+          <w:sz w:val="24"/>
+        </w:rPr>
+        <w:t xml:space="preserve">  1  </w:t>
+      </w:r>
+      <w:r>
+        <w:rPr>
+          <w:rFonts w:ascii="Calibri" w:hAnsi="Calibri"/>
+          <w:color w:val="1A1A2E"/>
+          <w:sz w:val="22"/>
+        </w:rPr>
+        <w:t>Open Terminal on your Mac.</w:t>
+      </w:r>
+    </w:p>
+    <w:p>
+      <w:pPr>
+        <w:spacing w:after="120" w:line="312" w:lineRule="auto"/>
+      </w:pPr>
+      <w:r>
+        <w:rPr>
+          <w:rFonts w:ascii="Georgia" w:hAnsi="Georgia"/>
+          <w:b/>
+          <w:color w:val="7C3AED"/>
+          <w:sz w:val="24"/>
+        </w:rPr>
+        <w:t xml:space="preserve">  2  </w:t>
+      </w:r>
+      <w:r>
+        <w:rPr>
+          <w:rFonts w:ascii="Calibri" w:hAnsi="Calibri"/>
+          <w:color w:val="1A1A2E"/>
+          <w:sz w:val="22"/>
+        </w:rPr>
+        <w:t>Type this command and press Enter:</w:t>
+      </w:r>
+    </w:p>
+    <w:p>
+      <w:pPr>
+        <w:shd w:fill="F0EDFA" w:val="clear"/>
+        <w:spacing w:before="160" w:after="160"/>
+      </w:pPr>
+      <w:r>
+        <w:rPr>
+          <w:rFonts w:ascii="Consolas" w:hAnsi="Consolas"/>
+          <w:b/>
+          <w:color w:val="7C3AED"/>
+          <w:sz w:val="20"/>
+        </w:rPr>
+        <w:t>cd ~/Desktop/driven-creations-webflow &amp;&amp; claude</w:t>
+      </w:r>
+    </w:p>
+    <w:p>
+      <w:pPr>
+        <w:spacing w:after="120" w:line="312" w:lineRule="auto"/>
+      </w:pPr>
+      <w:r>
+        <w:rPr>
+          <w:rFonts w:ascii="Georgia" w:hAnsi="Georgia"/>
+          <w:b/>
+          <w:color w:val="7C3AED"/>
+          <w:sz w:val="24"/>
+        </w:rPr>
+        <w:t xml:space="preserve">  3  </w:t>
+      </w:r>
+      <w:r>
+        <w:rPr>
+          <w:rFonts w:ascii="Calibri" w:hAnsi="Calibri"/>
+          <w:color w:val="1A1A2E"/>
+          <w:sz w:val="22"/>
+        </w:rPr>
+        <w:t>Wait for Claude to start up. You'll see a text prompt.</w:t>
+      </w:r>
+    </w:p>
+    <w:p>
+      <w:pPr>
+        <w:spacing w:after="120" w:line="312" w:lineRule="auto"/>
+      </w:pPr>
+      <w:r>
+        <w:rPr>
+          <w:rFonts w:ascii="Georgia" w:hAnsi="Georgia"/>
+          <w:b/>
+          <w:color w:val="7C3AED"/>
+          <w:sz w:val="24"/>
+        </w:rPr>
+        <w:t xml:space="preserve">  4  </w:t>
+      </w:r>
+      <w:r>
+        <w:rPr>
+          <w:rFonts w:ascii="Calibri" w:hAnsi="Calibri"/>
+          <w:color w:val="1A1A2E"/>
+          <w:sz w:val="22"/>
+        </w:rPr>
+        <w:t>Type what you want to change in plain English!</w:t>
+      </w:r>
+    </w:p>
+    <w:p>
+      <w:pPr>
+        <w:spacing w:before="0" w:after="120"/>
+      </w:pPr>
+    </w:p>
+    <w:p>
+      <w:pPr>
+        <w:spacing w:after="80" w:line="312" w:lineRule="auto"/>
+      </w:pPr>
+      <w:r>
+        <w:rPr>
+          <w:rFonts w:ascii="Calibri" w:hAnsi="Calibri"/>
+          <w:b/>
+          <w:i w:val="0"/>
+          <w:color w:val="7C3AED"/>
+          <w:sz w:val="22"/>
+        </w:rPr>
+        <w:t>Things you can say to Claude:</w:t>
+      </w:r>
+    </w:p>
+    <w:p>
+      <w:pPr>
+        <w:spacing w:before="0" w:after="40"/>
+      </w:pPr>
+    </w:p>
+    <w:p>
+      <w:pPr>
+        <w:spacing w:after="80"/>
+      </w:pPr>
+      <w:r>
+        <w:rPr>
+          <w:rFonts w:ascii="Calibri" w:hAnsi="Calibri"/>
+          <w:i/>
+          <w:color w:val="7C3AED"/>
+          <w:sz w:val="22"/>
+        </w:rPr>
+        <w:t xml:space="preserve">    "Change the homepage title to "My New Title""</w:t>
+      </w:r>
+    </w:p>
+    <w:p>
+      <w:pPr>
+        <w:spacing w:after="80"/>
+      </w:pPr>
+      <w:r>
+        <w:rPr>
+          <w:rFonts w:ascii="Calibri" w:hAnsi="Calibri"/>
+          <w:i/>
+          <w:color w:val="7C3AED"/>
+          <w:sz w:val="22"/>
+        </w:rPr>
+        <w:t xml:space="preserve">    "Update the YouTube video to this link: [paste link]"</w:t>
+      </w:r>
+    </w:p>
+    <w:p>
+      <w:pPr>
+        <w:spacing w:after="80"/>
+      </w:pPr>
+      <w:r>
+        <w:rPr>
+          <w:rFonts w:ascii="Calibri" w:hAnsi="Calibri"/>
+          <w:i/>
+          <w:color w:val="7C3AED"/>
+          <w:sz w:val="22"/>
+        </w:rPr>
+        <w:t xml:space="preserve">    "Add a new project page for [client name]"</w:t>
+      </w:r>
+    </w:p>
+    <w:p>
+      <w:pPr>
+        <w:spacing w:after="80"/>
+      </w:pPr>
+      <w:r>
+        <w:rPr>
+          <w:rFonts w:ascii="Calibri" w:hAnsi="Calibri"/>
+          <w:i/>
+          <w:color w:val="7C3AED"/>
+          <w:sz w:val="22"/>
+        </w:rPr>
+        <w:t xml:space="preserve">    "Change the purple color to blue across the whole site"</w:t>
+      </w:r>
+    </w:p>
+    <w:p>
+      <w:pPr>
+        <w:spacing w:after="80"/>
+      </w:pPr>
+      <w:r>
+        <w:rPr>
+          <w:rFonts w:ascii="Calibri" w:hAnsi="Calibri"/>
+          <w:i/>
+          <w:color w:val="7C3AED"/>
+          <w:sz w:val="22"/>
+        </w:rPr>
+        <w:t xml:space="preserve">    "Update the testimonial from [client] to say [new quote]"</w:t>
+      </w:r>
+    </w:p>
+    <w:p>
+      <w:pPr>
+        <w:spacing w:after="80"/>
+      </w:pPr>
+      <w:r>
+        <w:rPr>
+          <w:rFonts w:ascii="Calibri" w:hAnsi="Calibri"/>
+          <w:i/>
+          <w:color w:val="7C3AED"/>
+          <w:sz w:val="22"/>
+        </w:rPr>
+        <w:t xml:space="preserve">    "Change the contact email to hello@mysite.com"</w:t>
+      </w:r>
+    </w:p>
+    <w:p>
+      <w:pPr>
+        <w:spacing w:after="80"/>
+      </w:pPr>
+      <w:r>
+        <w:rPr>
+          <w:rFonts w:ascii="Calibri" w:hAnsi="Calibri"/>
+          <w:i/>
+          <w:color w:val="7C3AED"/>
+          <w:sz w:val="22"/>
+        </w:rPr>
+        <w:t xml:space="preserve">    "Add a new image to the about page"</w:t>
+      </w:r>
+    </w:p>
+    <w:p>
+      <w:pPr>
+        <w:spacing w:after="80"/>
+      </w:pPr>
+      <w:r>
+        <w:rPr>
+          <w:rFonts w:ascii="Calibri" w:hAnsi="Calibri"/>
+          <w:i/>
+          <w:color w:val="7C3AED"/>
+          <w:sz w:val="22"/>
+        </w:rPr>
+        <w:t xml:space="preserve">    "Make the logo bigger on mobile"</w:t>
+      </w:r>
+    </w:p>
+    <w:p>
+      <w:pPr>
+        <w:spacing w:after="80"/>
+      </w:pPr>
+      <w:r>
+        <w:rPr>
+          <w:rFonts w:ascii="Calibri" w:hAnsi="Calibri"/>
+          <w:i/>
+          <w:color w:val="7C3AED"/>
+          <w:sz w:val="22"/>
+        </w:rPr>
+        <w:t xml:space="preserve">    "Deploy the site to Vercel"</w:t>
+      </w:r>
+    </w:p>
+    <w:p>
+      <w:pPr>
+        <w:spacing w:before="0" w:after="80"/>
+      </w:pPr>
+    </w:p>
+    <w:p>
+      <w:pPr>
+        <w:spacing w:after="80" w:line="312" w:lineRule="auto"/>
+      </w:pPr>
+      <w:r>
+        <w:rPr>
+          <w:rFonts w:ascii="Calibri" w:hAnsi="Calibri"/>
+          <w:b/>
+          <w:i w:val="0"/>
+          <w:sz w:val="22"/>
+        </w:rPr>
+        <w:t>When you're finished, say:</w:t>
+      </w:r>
+    </w:p>
+    <w:p>
+      <w:pPr>
+        <w:shd w:fill="F0EDFA" w:val="clear"/>
+        <w:spacing w:before="160" w:after="160"/>
+      </w:pPr>
+      <w:r>
+        <w:rPr>
+          <w:rFonts w:ascii="Consolas" w:hAnsi="Consolas"/>
+          <w:b/>
+          <w:color w:val="7C3AED"/>
+          <w:sz w:val="20"/>
+        </w:rPr>
+        <w:t>"Commit and deploy the site"</w:t>
+      </w:r>
+    </w:p>
+    <w:p>
+      <w:pPr>
+        <w:spacing w:after="80" w:line="312" w:lineRule="auto"/>
+      </w:pPr>
+      <w:r>
+        <w:rPr>
+          <w:rFonts w:ascii="Calibri" w:hAnsi="Calibri"/>
+          <w:b w:val="0"/>
+          <w:i w:val="0"/>
+          <w:sz w:val="22"/>
+        </w:rPr>
+        <w:t>Claude will save everything to GitHub AND push it live automatically!</w:t>
+      </w:r>
+    </w:p>
+    <w:p>
+      <w:pPr>
+        <w:spacing w:before="0" w:after="80"/>
+      </w:pPr>
+    </w:p>
+    <w:p>
+      <w:pPr>
+        <w:spacing w:after="80" w:line="312" w:lineRule="auto"/>
+      </w:pPr>
+      <w:r>
+        <w:rPr>
+          <w:rFonts w:ascii="Calibri" w:hAnsi="Calibri"/>
+          <w:b/>
+          <w:i w:val="0"/>
+          <w:sz w:val="22"/>
+        </w:rPr>
+        <w:t>To exit Claude Code:</w:t>
+      </w:r>
+    </w:p>
+    <w:p>
+      <w:pPr>
+        <w:shd w:fill="F0EDFA" w:val="clear"/>
+        <w:spacing w:before="160" w:after="160"/>
+      </w:pPr>
+      <w:r>
+        <w:rPr>
+          <w:rFonts w:ascii="Consolas" w:hAnsi="Consolas"/>
+          <w:b/>
+          <w:color w:val="7C3AED"/>
+          <w:sz w:val="20"/>
+        </w:rPr>
+        <w:t>/exit</w:t>
+      </w:r>
+    </w:p>
+    <w:p>
+      <w:pPr>
+        <w:spacing w:before="0" w:after="200"/>
+      </w:pPr>
+    </w:p>
+    <w:p>
+      <w:r>
+        <w:rPr>
+          <w:rFonts w:ascii="Georgia" w:hAnsi="Georgia"/>
+          <w:b/>
+          <w:color w:val="7C3AED"/>
+          <w:sz w:val="48"/>
+        </w:rPr>
+        <w:t>B</w:t>
+      </w:r>
+      <w:r>
+        <w:rPr>
+          <w:rFonts w:ascii="Calibri" w:hAnsi="Calibri"/>
+          <w:b/>
+          <w:color w:val="1A1A2E"/>
+          <w:sz w:val="26"/>
+        </w:rPr>
+        <w:t xml:space="preserve">   CLAUDE INSIDE VS CODE</w:t>
       </w:r>
     </w:p>
     <w:p>
       <w:r>
-        <w:t>Step 3: Tell Claude what you want to change. For example:</w:t>
-      </w:r>
-    </w:p>
-    <w:p/>
-    <w:p>
-      <w:pPr>
-        <w:pStyle w:val="ListBullet"/>
-      </w:pPr>
-      <w:r>
         <w:rPr>
-          <w:color w:val="553399"/>
+          <w:color w:val="A78BFA"/>
+          <w:sz w:val="12"/>
         </w:rPr>
-        <w:t>"Change the homepage title to My New Title"</w:t>
+        <w:t>_______________________________________________</w:t>
       </w:r>
     </w:p>
     <w:p>
       <w:pPr>
-        <w:pStyle w:val="ListBullet"/>
+        <w:spacing w:before="0" w:after="80"/>
+      </w:pPr>
+    </w:p>
+    <w:p>
+      <w:pPr>
+        <w:spacing w:after="80" w:line="312" w:lineRule="auto"/>
       </w:pPr>
       <w:r>
         <w:rPr>
-          <w:color w:val="553399"/>
+          <w:rFonts w:ascii="Calibri" w:hAnsi="Calibri"/>
+          <w:b w:val="0"/>
+          <w:i w:val="0"/>
+          <w:sz w:val="22"/>
         </w:rPr>
-        <w:t>"Update the YouTube video to this link: [paste link]"</w:t>
+        <w:t>If you prefer seeing all your files visually while editing, VS Code with Claude gives you the best of both worlds.</w:t>
       </w:r>
     </w:p>
     <w:p>
       <w:pPr>
-        <w:pStyle w:val="ListBullet"/>
+        <w:spacing w:before="0" w:after="80"/>
+      </w:pPr>
+    </w:p>
+    <w:p>
+      <w:pPr>
+        <w:spacing w:after="80" w:line="312" w:lineRule="auto"/>
       </w:pPr>
       <w:r>
         <w:rPr>
-          <w:color w:val="553399"/>
+          <w:rFonts w:ascii="Calibri" w:hAnsi="Calibri"/>
+          <w:b/>
+          <w:i w:val="0"/>
+          <w:sz w:val="22"/>
         </w:rPr>
-        <w:t>"Add a new project page for [client name]"</w:t>
+        <w:t>One-time setup:</w:t>
       </w:r>
     </w:p>
     <w:p>
       <w:pPr>
-        <w:pStyle w:val="ListBullet"/>
+        <w:spacing w:after="120" w:line="312" w:lineRule="auto"/>
       </w:pPr>
       <w:r>
         <w:rPr>
-          <w:color w:val="553399"/>
+          <w:rFonts w:ascii="Georgia" w:hAnsi="Georgia"/>
+          <w:b/>
+          <w:color w:val="7C3AED"/>
+          <w:sz w:val="24"/>
         </w:rPr>
-        <w:t>"Change the purple color to blue across the whole site"</w:t>
+        <w:t xml:space="preserve">  1  </w:t>
+      </w:r>
+      <w:r>
+        <w:rPr>
+          <w:rFonts w:ascii="Calibri" w:hAnsi="Calibri"/>
+          <w:color w:val="1A1A2E"/>
+          <w:sz w:val="22"/>
+        </w:rPr>
+        <w:t>Download VS Code from https://code.visualstudio.com</w:t>
       </w:r>
     </w:p>
     <w:p>
       <w:pPr>
-        <w:pStyle w:val="ListBullet"/>
+        <w:spacing w:after="120" w:line="312" w:lineRule="auto"/>
       </w:pPr>
       <w:r>
         <w:rPr>
-          <w:color w:val="553399"/>
+          <w:rFonts w:ascii="Georgia" w:hAnsi="Georgia"/>
+          <w:b/>
+          <w:color w:val="7C3AED"/>
+          <w:sz w:val="24"/>
         </w:rPr>
-        <w:t>"Update the testimonial from [client] to say [new quote]"</w:t>
+        <w:t xml:space="preserve">  2  </w:t>
+      </w:r>
+      <w:r>
+        <w:rPr>
+          <w:rFonts w:ascii="Calibri" w:hAnsi="Calibri"/>
+          <w:color w:val="1A1A2E"/>
+          <w:sz w:val="22"/>
+        </w:rPr>
+        <w:t>Open VS Code and install the "Claude Code" extension:</w:t>
       </w:r>
     </w:p>
     <w:p>
       <w:pPr>
         <w:pStyle w:val="ListBullet"/>
+        <w:spacing w:after="60" w:line="312" w:lineRule="auto"/>
       </w:pPr>
       <w:r>
         <w:rPr>
-          <w:color w:val="553399"/>
+          <w:rFonts w:ascii="Calibri" w:hAnsi="Calibri"/>
+          <w:color w:val="1A1A2E"/>
+          <w:sz w:val="22"/>
         </w:rPr>
-        <w:t>"Deploy the site to Vercel"</w:t>
+        <w:t>Click the Extensions icon (puzzle piece) on the left sidebar</w:t>
       </w:r>
     </w:p>
-    <w:p/>
+    <w:p>
+      <w:pPr>
+        <w:pStyle w:val="ListBullet"/>
+        <w:spacing w:after="60" w:line="312" w:lineRule="auto"/>
+      </w:pPr>
+      <w:r>
+        <w:rPr>
+          <w:rFonts w:ascii="Calibri" w:hAnsi="Calibri"/>
+          <w:color w:val="1A1A2E"/>
+          <w:sz w:val="22"/>
+        </w:rPr>
+        <w:t>Search for "Claude Code"</w:t>
+      </w:r>
+    </w:p>
+    <w:p>
+      <w:pPr>
+        <w:pStyle w:val="ListBullet"/>
+        <w:spacing w:after="60" w:line="312" w:lineRule="auto"/>
+      </w:pPr>
+      <w:r>
+        <w:rPr>
+          <w:rFonts w:ascii="Calibri" w:hAnsi="Calibri"/>
+          <w:color w:val="1A1A2E"/>
+          <w:sz w:val="22"/>
+        </w:rPr>
+        <w:t>Click Install</w:t>
+      </w:r>
+    </w:p>
+    <w:p>
+      <w:pPr>
+        <w:spacing w:after="120" w:line="312" w:lineRule="auto"/>
+      </w:pPr>
+      <w:r>
+        <w:rPr>
+          <w:rFonts w:ascii="Georgia" w:hAnsi="Georgia"/>
+          <w:b/>
+          <w:color w:val="7C3AED"/>
+          <w:sz w:val="24"/>
+        </w:rPr>
+        <w:t xml:space="preserve">  3  </w:t>
+      </w:r>
+      <w:r>
+        <w:rPr>
+          <w:rFonts w:ascii="Calibri" w:hAnsi="Calibri"/>
+          <w:color w:val="1A1A2E"/>
+          <w:sz w:val="22"/>
+        </w:rPr>
+        <w:t>Open your website folder: File &gt; Open Folder &gt; Desktop &gt; driven-creations-webflow</w:t>
+      </w:r>
+    </w:p>
+    <w:p>
+      <w:pPr>
+        <w:spacing w:before="0" w:after="80"/>
+      </w:pPr>
+    </w:p>
+    <w:p>
+      <w:pPr>
+        <w:spacing w:after="80" w:line="312" w:lineRule="auto"/>
+      </w:pPr>
+      <w:r>
+        <w:rPr>
+          <w:rFonts w:ascii="Calibri" w:hAnsi="Calibri"/>
+          <w:b/>
+          <w:i w:val="0"/>
+          <w:sz w:val="22"/>
+        </w:rPr>
+        <w:t>How to use it:</w:t>
+      </w:r>
+    </w:p>
+    <w:p>
+      <w:pPr>
+        <w:spacing w:after="120" w:line="312" w:lineRule="auto"/>
+      </w:pPr>
+      <w:r>
+        <w:rPr>
+          <w:rFonts w:ascii="Georgia" w:hAnsi="Georgia"/>
+          <w:b/>
+          <w:color w:val="7C3AED"/>
+          <w:sz w:val="24"/>
+        </w:rPr>
+        <w:t xml:space="preserve">  1  </w:t>
+      </w:r>
+      <w:r>
+        <w:rPr>
+          <w:rFonts w:ascii="Calibri" w:hAnsi="Calibri"/>
+          <w:color w:val="1A1A2E"/>
+          <w:sz w:val="22"/>
+        </w:rPr>
+        <w:t>Open the Claude panel (click the Claude icon in the sidebar).</w:t>
+      </w:r>
+    </w:p>
+    <w:p>
+      <w:pPr>
+        <w:spacing w:after="120" w:line="312" w:lineRule="auto"/>
+      </w:pPr>
+      <w:r>
+        <w:rPr>
+          <w:rFonts w:ascii="Georgia" w:hAnsi="Georgia"/>
+          <w:b/>
+          <w:color w:val="7C3AED"/>
+          <w:sz w:val="24"/>
+        </w:rPr>
+        <w:t xml:space="preserve">  2  </w:t>
+      </w:r>
+      <w:r>
+        <w:rPr>
+          <w:rFonts w:ascii="Calibri" w:hAnsi="Calibri"/>
+          <w:color w:val="1A1A2E"/>
+          <w:sz w:val="22"/>
+        </w:rPr>
+        <w:t>Type what you want to change in the chat, just like texting.</w:t>
+      </w:r>
+    </w:p>
+    <w:p>
+      <w:pPr>
+        <w:spacing w:after="120" w:line="312" w:lineRule="auto"/>
+      </w:pPr>
+      <w:r>
+        <w:rPr>
+          <w:rFonts w:ascii="Georgia" w:hAnsi="Georgia"/>
+          <w:b/>
+          <w:color w:val="7C3AED"/>
+          <w:sz w:val="24"/>
+        </w:rPr>
+        <w:t xml:space="preserve">  3  </w:t>
+      </w:r>
+      <w:r>
+        <w:rPr>
+          <w:rFonts w:ascii="Calibri" w:hAnsi="Calibri"/>
+          <w:color w:val="1A1A2E"/>
+          <w:sz w:val="22"/>
+        </w:rPr>
+        <w:t>Claude shows you the changes and applies them to your files.</w:t>
+      </w:r>
+    </w:p>
+    <w:p>
+      <w:pPr>
+        <w:spacing w:after="120" w:line="312" w:lineRule="auto"/>
+      </w:pPr>
+      <w:r>
+        <w:rPr>
+          <w:rFonts w:ascii="Georgia" w:hAnsi="Georgia"/>
+          <w:b/>
+          <w:color w:val="7C3AED"/>
+          <w:sz w:val="24"/>
+        </w:rPr>
+        <w:t xml:space="preserve">  4  </w:t>
+      </w:r>
+      <w:r>
+        <w:rPr>
+          <w:rFonts w:ascii="Calibri" w:hAnsi="Calibri"/>
+          <w:color w:val="1A1A2E"/>
+          <w:sz w:val="22"/>
+        </w:rPr>
+        <w:t>You can see changes highlighted in real time!</w:t>
+      </w:r>
+    </w:p>
+    <w:p>
+      <w:pPr>
+        <w:spacing w:after="120" w:line="312" w:lineRule="auto"/>
+      </w:pPr>
+      <w:r>
+        <w:rPr>
+          <w:rFonts w:ascii="Georgia" w:hAnsi="Georgia"/>
+          <w:b/>
+          <w:color w:val="7C3AED"/>
+          <w:sz w:val="24"/>
+        </w:rPr>
+        <w:t xml:space="preserve">  5  </w:t>
+      </w:r>
+      <w:r>
+        <w:rPr>
+          <w:rFonts w:ascii="Calibri" w:hAnsi="Calibri"/>
+          <w:color w:val="1A1A2E"/>
+          <w:sz w:val="22"/>
+        </w:rPr>
+        <w:t>When done, ask Claude to "commit and deploy."</w:t>
+      </w:r>
+    </w:p>
+    <w:p>
+      <w:pPr>
+        <w:spacing w:before="0" w:after="200"/>
+      </w:pPr>
+    </w:p>
     <w:p>
       <w:r>
-        <w:t>Claude can edit files, save to GitHub, AND deploy to Vercel — all in one step!</w:t>
+        <w:rPr>
+          <w:rFonts w:ascii="Georgia" w:hAnsi="Georgia"/>
+          <w:b/>
+          <w:color w:val="7C3AED"/>
+          <w:sz w:val="48"/>
+        </w:rPr>
+        <w:t>C</w:t>
       </w:r>
-    </w:p>
-    <w:p/>
-    <w:p>
-      <w:pPr>
-        <w:pStyle w:val="Heading1"/>
-      </w:pPr>
       <w:r>
-        <w:t>8. How to Add a New Project Page</w:t>
+        <w:rPr>
+          <w:rFonts w:ascii="Calibri" w:hAnsi="Calibri"/>
+          <w:b/>
+          <w:color w:val="1A1A2E"/>
+          <w:sz w:val="26"/>
+        </w:rPr>
+        <w:t xml:space="preserve">   CURSOR EDITOR</w:t>
       </w:r>
     </w:p>
     <w:p>
       <w:r>
-        <w:t>Step 1: Copy any existing project file from the work/ folder (like work/forgent-power.html)</w:t>
+        <w:rPr>
+          <w:color w:val="A78BFA"/>
+          <w:sz w:val="12"/>
+        </w:rPr>
+        <w:t>_______________________________________________</w:t>
+      </w:r>
+    </w:p>
+    <w:p>
+      <w:pPr>
+        <w:spacing w:before="0" w:after="80"/>
+      </w:pPr>
+    </w:p>
+    <w:p>
+      <w:pPr>
+        <w:spacing w:after="80" w:line="312" w:lineRule="auto"/>
+      </w:pPr>
+      <w:r>
+        <w:rPr>
+          <w:rFonts w:ascii="Calibri" w:hAnsi="Calibri"/>
+          <w:b w:val="0"/>
+          <w:i w:val="0"/>
+          <w:sz w:val="22"/>
+        </w:rPr>
+        <w:t>Cursor is a code editor with AI built directly into it. Very similar to VS Code but with extra AI superpowers.</w:t>
+      </w:r>
+    </w:p>
+    <w:p>
+      <w:pPr>
+        <w:spacing w:before="0" w:after="80"/>
+      </w:pPr>
+    </w:p>
+    <w:p>
+      <w:pPr>
+        <w:spacing w:after="80" w:line="312" w:lineRule="auto"/>
+      </w:pPr>
+      <w:r>
+        <w:rPr>
+          <w:rFonts w:ascii="Calibri" w:hAnsi="Calibri"/>
+          <w:b/>
+          <w:i w:val="0"/>
+          <w:sz w:val="22"/>
+        </w:rPr>
+        <w:t>One-time setup:</w:t>
+      </w:r>
+    </w:p>
+    <w:p>
+      <w:pPr>
+        <w:spacing w:after="120" w:line="312" w:lineRule="auto"/>
+      </w:pPr>
+      <w:r>
+        <w:rPr>
+          <w:rFonts w:ascii="Georgia" w:hAnsi="Georgia"/>
+          <w:b/>
+          <w:color w:val="7C3AED"/>
+          <w:sz w:val="24"/>
+        </w:rPr>
+        <w:t xml:space="preserve">  1  </w:t>
+      </w:r>
+      <w:r>
+        <w:rPr>
+          <w:rFonts w:ascii="Calibri" w:hAnsi="Calibri"/>
+          <w:color w:val="1A1A2E"/>
+          <w:sz w:val="22"/>
+        </w:rPr>
+        <w:t>Download Cursor from https://cursor.com</w:t>
+      </w:r>
+    </w:p>
+    <w:p>
+      <w:pPr>
+        <w:spacing w:after="120" w:line="312" w:lineRule="auto"/>
+      </w:pPr>
+      <w:r>
+        <w:rPr>
+          <w:rFonts w:ascii="Georgia" w:hAnsi="Georgia"/>
+          <w:b/>
+          <w:color w:val="7C3AED"/>
+          <w:sz w:val="24"/>
+        </w:rPr>
+        <w:t xml:space="preserve">  2  </w:t>
+      </w:r>
+      <w:r>
+        <w:rPr>
+          <w:rFonts w:ascii="Calibri" w:hAnsi="Calibri"/>
+          <w:color w:val="1A1A2E"/>
+          <w:sz w:val="22"/>
+        </w:rPr>
+        <w:t>Install and open Cursor.</w:t>
+      </w:r>
+    </w:p>
+    <w:p>
+      <w:pPr>
+        <w:spacing w:after="120" w:line="312" w:lineRule="auto"/>
+      </w:pPr>
+      <w:r>
+        <w:rPr>
+          <w:rFonts w:ascii="Georgia" w:hAnsi="Georgia"/>
+          <w:b/>
+          <w:color w:val="7C3AED"/>
+          <w:sz w:val="24"/>
+        </w:rPr>
+        <w:t xml:space="preserve">  3  </w:t>
+      </w:r>
+      <w:r>
+        <w:rPr>
+          <w:rFonts w:ascii="Calibri" w:hAnsi="Calibri"/>
+          <w:color w:val="1A1A2E"/>
+          <w:sz w:val="22"/>
+        </w:rPr>
+        <w:t>Open your website folder: File &gt; Open Folder &gt; Desktop &gt; driven-creations-webflow</w:t>
+      </w:r>
+    </w:p>
+    <w:p>
+      <w:pPr>
+        <w:spacing w:before="0" w:after="80"/>
+      </w:pPr>
+    </w:p>
+    <w:p>
+      <w:pPr>
+        <w:spacing w:after="80" w:line="312" w:lineRule="auto"/>
+      </w:pPr>
+      <w:r>
+        <w:rPr>
+          <w:rFonts w:ascii="Calibri" w:hAnsi="Calibri"/>
+          <w:b/>
+          <w:i w:val="0"/>
+          <w:sz w:val="22"/>
+        </w:rPr>
+        <w:t>How to use it:</w:t>
+      </w:r>
+    </w:p>
+    <w:p>
+      <w:pPr>
+        <w:spacing w:after="120" w:line="312" w:lineRule="auto"/>
+      </w:pPr>
+      <w:r>
+        <w:rPr>
+          <w:rFonts w:ascii="Georgia" w:hAnsi="Georgia"/>
+          <w:b/>
+          <w:color w:val="7C3AED"/>
+          <w:sz w:val="24"/>
+        </w:rPr>
+        <w:t xml:space="preserve">  1  </w:t>
+      </w:r>
+      <w:r>
+        <w:rPr>
+          <w:rFonts w:ascii="Calibri" w:hAnsi="Calibri"/>
+          <w:color w:val="1A1A2E"/>
+          <w:sz w:val="22"/>
+        </w:rPr>
+        <w:t>Press Cmd + L to open the AI chat panel.</w:t>
+      </w:r>
+    </w:p>
+    <w:p>
+      <w:pPr>
+        <w:spacing w:after="120" w:line="312" w:lineRule="auto"/>
+      </w:pPr>
+      <w:r>
+        <w:rPr>
+          <w:rFonts w:ascii="Georgia" w:hAnsi="Georgia"/>
+          <w:b/>
+          <w:color w:val="7C3AED"/>
+          <w:sz w:val="24"/>
+        </w:rPr>
+        <w:t xml:space="preserve">  2  </w:t>
+      </w:r>
+      <w:r>
+        <w:rPr>
+          <w:rFonts w:ascii="Calibri" w:hAnsi="Calibri"/>
+          <w:color w:val="1A1A2E"/>
+          <w:sz w:val="22"/>
+        </w:rPr>
+        <w:t>Type what you want in plain English.</w:t>
+      </w:r>
+    </w:p>
+    <w:p>
+      <w:pPr>
+        <w:spacing w:after="120" w:line="312" w:lineRule="auto"/>
+      </w:pPr>
+      <w:r>
+        <w:rPr>
+          <w:rFonts w:ascii="Georgia" w:hAnsi="Georgia"/>
+          <w:b/>
+          <w:color w:val="7C3AED"/>
+          <w:sz w:val="24"/>
+        </w:rPr>
+        <w:t xml:space="preserve">  3  </w:t>
+      </w:r>
+      <w:r>
+        <w:rPr>
+          <w:rFonts w:ascii="Calibri" w:hAnsi="Calibri"/>
+          <w:color w:val="1A1A2E"/>
+          <w:sz w:val="22"/>
+        </w:rPr>
+        <w:t>Cursor suggests changes — click "Accept" to apply them.</w:t>
+      </w:r>
+    </w:p>
+    <w:p>
+      <w:pPr>
+        <w:spacing w:after="120" w:line="312" w:lineRule="auto"/>
+      </w:pPr>
+      <w:r>
+        <w:rPr>
+          <w:rFonts w:ascii="Georgia" w:hAnsi="Georgia"/>
+          <w:b/>
+          <w:color w:val="7C3AED"/>
+          <w:sz w:val="24"/>
+        </w:rPr>
+        <w:t xml:space="preserve">  4  </w:t>
+      </w:r>
+      <w:r>
+        <w:rPr>
+          <w:rFonts w:ascii="Calibri" w:hAnsi="Calibri"/>
+          <w:color w:val="1A1A2E"/>
+          <w:sz w:val="22"/>
+        </w:rPr>
+        <w:t>To deploy, open Terminal inside Cursor (View &gt; Terminal) and paste the deploy command from Section 06.</w:t>
+      </w:r>
+    </w:p>
+    <w:p>
+      <w:pPr>
+        <w:spacing w:before="0" w:after="160"/>
+      </w:pPr>
+    </w:p>
+    <w:p>
+      <w:r>
+        <w:rPr>
+          <w:rFonts w:ascii="Calibri" w:hAnsi="Calibri"/>
+          <w:b/>
+          <w:color w:val="7C3AED"/>
+          <w:sz w:val="24"/>
+        </w:rPr>
+        <w:t>TIPS FOR ALL AI TOOLS</w:t>
       </w:r>
     </w:p>
     <w:p>
       <w:r>
-        <w:t>Step 2: Rename the copy to your new project name (like work/new-client.html)</w:t>
+        <w:rPr>
+          <w:color w:val="A78BFA"/>
+          <w:sz w:val="12"/>
+        </w:rPr>
+        <w:t>_______________________________________________</w:t>
+      </w:r>
+    </w:p>
+    <w:p>
+      <w:pPr>
+        <w:spacing w:before="0" w:after="80"/>
+      </w:pPr>
+    </w:p>
+    <w:p>
+      <w:pPr>
+        <w:pStyle w:val="ListBullet"/>
+        <w:spacing w:after="60" w:line="312" w:lineRule="auto"/>
+      </w:pPr>
+      <w:r>
+        <w:rPr>
+          <w:rFonts w:ascii="Calibri" w:hAnsi="Calibri"/>
+          <w:color w:val="1A1A2E"/>
+          <w:sz w:val="22"/>
+        </w:rPr>
+        <w:t>Be specific about what page and section you want to edit. Say "On the homepage, change the hero title to..." instead of just "change the title."</w:t>
+      </w:r>
+    </w:p>
+    <w:p>
+      <w:pPr>
+        <w:pStyle w:val="ListBullet"/>
+        <w:spacing w:after="60" w:line="312" w:lineRule="auto"/>
+      </w:pPr>
+      <w:r>
+        <w:rPr>
+          <w:rFonts w:ascii="Calibri" w:hAnsi="Calibri"/>
+          <w:color w:val="1A1A2E"/>
+          <w:sz w:val="22"/>
+        </w:rPr>
+        <w:t>You can paste URLs or links and ask the AI to update content.</w:t>
+      </w:r>
+    </w:p>
+    <w:p>
+      <w:pPr>
+        <w:pStyle w:val="ListBullet"/>
+        <w:spacing w:after="60" w:line="312" w:lineRule="auto"/>
+      </w:pPr>
+      <w:r>
+        <w:rPr>
+          <w:rFonts w:ascii="Calibri" w:hAnsi="Calibri"/>
+          <w:color w:val="1A1A2E"/>
+          <w:sz w:val="22"/>
+        </w:rPr>
+        <w:t>Always ask the AI to deploy when you're done so changes go live.</w:t>
+      </w:r>
+    </w:p>
+    <w:p>
+      <w:pPr>
+        <w:pStyle w:val="ListBullet"/>
+        <w:spacing w:after="60" w:line="312" w:lineRule="auto"/>
+      </w:pPr>
+      <w:r>
+        <w:rPr>
+          <w:rFonts w:ascii="Calibri" w:hAnsi="Calibri"/>
+          <w:color w:val="1A1A2E"/>
+          <w:sz w:val="22"/>
+        </w:rPr>
+        <w:t>If something looks wrong, just say: "Undo the last change" or "That doesn't look right, fix it."</w:t>
+      </w:r>
+    </w:p>
+    <w:p>
+      <w:pPr>
+        <w:pStyle w:val="ListBullet"/>
+        <w:spacing w:after="60" w:line="312" w:lineRule="auto"/>
+      </w:pPr>
+      <w:r>
+        <w:rPr>
+          <w:rFonts w:ascii="Calibri" w:hAnsi="Calibri"/>
+          <w:color w:val="1A1A2E"/>
+          <w:sz w:val="22"/>
+        </w:rPr>
+        <w:t>You can make multiple changes in one session. No need to restart.</w:t>
+      </w:r>
+    </w:p>
+    <w:p>
+      <w:pPr>
+        <w:pStyle w:val="ListBullet"/>
+        <w:spacing w:after="60" w:line="312" w:lineRule="auto"/>
+      </w:pPr>
+      <w:r>
+        <w:rPr>
+          <w:rFonts w:ascii="Calibri" w:hAnsi="Calibri"/>
+          <w:color w:val="1A1A2E"/>
+          <w:sz w:val="22"/>
+        </w:rPr>
+        <w:t>The AI can also explain what any part of the code does if you're curious.</w:t>
+      </w:r>
+    </w:p>
+    <w:p>
+      <w:pPr>
+        <w:pStyle w:val="ListBullet"/>
+        <w:spacing w:after="60" w:line="312" w:lineRule="auto"/>
+      </w:pPr>
+      <w:r>
+        <w:rPr>
+          <w:rFonts w:ascii="Calibri" w:hAnsi="Calibri"/>
+          <w:color w:val="1A1A2E"/>
+          <w:sz w:val="22"/>
+        </w:rPr>
+        <w:t>If the AI asks you a question, answer it like a normal conversation.</w:t>
       </w:r>
     </w:p>
     <w:p>
       <w:r>
-        <w:t>Step 3: Open the file and change all the text, images, and links to match the new project.</w:t>
+        <w:br w:type="page"/>
       </w:r>
     </w:p>
     <w:p>
       <w:r>
-        <w:t>Step 4: Add a card linking to the new project in index.html and work.html</w:t>
+        <w:rPr>
+          <w:rFonts w:ascii="Georgia" w:hAnsi="Georgia"/>
+          <w:b/>
+          <w:color w:val="7C3AED"/>
+          <w:sz w:val="56"/>
+        </w:rPr>
+        <w:t xml:space="preserve">08  </w:t>
+      </w:r>
+      <w:r>
+        <w:rPr>
+          <w:rFonts w:ascii="Calibri" w:hAnsi="Calibri"/>
+          <w:b/>
+          <w:color w:val="1A1A2E"/>
+          <w:sz w:val="28"/>
+        </w:rPr>
+        <w:t>ADDING A NEW PROJECT PAGE</w:t>
       </w:r>
     </w:p>
     <w:p>
       <w:r>
-        <w:t>Step 5: Push your changes live (see Section 6)</w:t>
+        <w:rPr>
+          <w:color w:val="A78BFA"/>
+          <w:sz w:val="12"/>
+        </w:rPr>
+        <w:t>________________________________________________________________________</w:t>
       </w:r>
     </w:p>
-    <w:p/>
+    <w:p>
+      <w:pPr>
+        <w:spacing w:before="0" w:after="120"/>
+      </w:pPr>
+    </w:p>
+    <w:p>
+      <w:pPr>
+        <w:spacing w:after="120" w:line="312" w:lineRule="auto"/>
+      </w:pPr>
+      <w:r>
+        <w:rPr>
+          <w:rFonts w:ascii="Georgia" w:hAnsi="Georgia"/>
+          <w:b/>
+          <w:color w:val="7C3AED"/>
+          <w:sz w:val="24"/>
+        </w:rPr>
+        <w:t xml:space="preserve">  1  </w:t>
+      </w:r>
+      <w:r>
+        <w:rPr>
+          <w:rFonts w:ascii="Calibri" w:hAnsi="Calibri"/>
+          <w:color w:val="1A1A2E"/>
+          <w:sz w:val="22"/>
+        </w:rPr>
+        <w:t>Copy any existing project file from the work/ folder (like work/forgent-power.html).</w:t>
+      </w:r>
+    </w:p>
+    <w:p>
+      <w:pPr>
+        <w:spacing w:after="120" w:line="312" w:lineRule="auto"/>
+      </w:pPr>
+      <w:r>
+        <w:rPr>
+          <w:rFonts w:ascii="Georgia" w:hAnsi="Georgia"/>
+          <w:b/>
+          <w:color w:val="7C3AED"/>
+          <w:sz w:val="24"/>
+        </w:rPr>
+        <w:t xml:space="preserve">  2  </w:t>
+      </w:r>
+      <w:r>
+        <w:rPr>
+          <w:rFonts w:ascii="Calibri" w:hAnsi="Calibri"/>
+          <w:color w:val="1A1A2E"/>
+          <w:sz w:val="22"/>
+        </w:rPr>
+        <w:t>Rename the copy to your new project name (like work/new-client.html).</w:t>
+      </w:r>
+    </w:p>
+    <w:p>
+      <w:pPr>
+        <w:spacing w:after="120" w:line="312" w:lineRule="auto"/>
+      </w:pPr>
+      <w:r>
+        <w:rPr>
+          <w:rFonts w:ascii="Georgia" w:hAnsi="Georgia"/>
+          <w:b/>
+          <w:color w:val="7C3AED"/>
+          <w:sz w:val="24"/>
+        </w:rPr>
+        <w:t xml:space="preserve">  3  </w:t>
+      </w:r>
+      <w:r>
+        <w:rPr>
+          <w:rFonts w:ascii="Calibri" w:hAnsi="Calibri"/>
+          <w:color w:val="1A1A2E"/>
+          <w:sz w:val="22"/>
+        </w:rPr>
+        <w:t>Open the file and change all the text, images, and links to match the new project.</w:t>
+      </w:r>
+    </w:p>
+    <w:p>
+      <w:pPr>
+        <w:spacing w:after="120" w:line="312" w:lineRule="auto"/>
+      </w:pPr>
+      <w:r>
+        <w:rPr>
+          <w:rFonts w:ascii="Georgia" w:hAnsi="Georgia"/>
+          <w:b/>
+          <w:color w:val="7C3AED"/>
+          <w:sz w:val="24"/>
+        </w:rPr>
+        <w:t xml:space="preserve">  4  </w:t>
+      </w:r>
+      <w:r>
+        <w:rPr>
+          <w:rFonts w:ascii="Calibri" w:hAnsi="Calibri"/>
+          <w:color w:val="1A1A2E"/>
+          <w:sz w:val="22"/>
+        </w:rPr>
+        <w:t>Add a card linking to the new project in index.html and work.html.</w:t>
+      </w:r>
+    </w:p>
+    <w:p>
+      <w:pPr>
+        <w:spacing w:after="120" w:line="312" w:lineRule="auto"/>
+      </w:pPr>
+      <w:r>
+        <w:rPr>
+          <w:rFonts w:ascii="Georgia" w:hAnsi="Georgia"/>
+          <w:b/>
+          <w:color w:val="7C3AED"/>
+          <w:sz w:val="24"/>
+        </w:rPr>
+        <w:t xml:space="preserve">  5  </w:t>
+      </w:r>
+      <w:r>
+        <w:rPr>
+          <w:rFonts w:ascii="Calibri" w:hAnsi="Calibri"/>
+          <w:color w:val="1A1A2E"/>
+          <w:sz w:val="22"/>
+        </w:rPr>
+        <w:t>Push your changes live (see Section 06).</w:t>
+      </w:r>
+    </w:p>
+    <w:p>
+      <w:pPr>
+        <w:spacing w:before="0" w:after="80"/>
+      </w:pPr>
+    </w:p>
+    <w:p>
+      <w:pPr>
+        <w:shd w:fill="F5F0FF" w:val="clear"/>
+        <w:spacing w:before="120" w:after="120"/>
+      </w:pPr>
+      <w:r>
+        <w:rPr>
+          <w:rFonts w:ascii="Calibri" w:hAnsi="Calibri"/>
+          <w:b/>
+          <w:color w:val="FFFFFF"/>
+          <w:sz w:val="18"/>
+        </w:rPr>
+        <w:t xml:space="preserve">  TIP  </w:t>
+      </w:r>
+      <w:r>
+        <w:rPr>
+          <w:rFonts w:ascii="Calibri" w:hAnsi="Calibri"/>
+          <w:i/>
+          <w:color w:val="7C3AED"/>
+          <w:sz w:val="20"/>
+        </w:rPr>
+        <w:t xml:space="preserve">  Or just ask Claude: "Add a new project page for [client name]" and it does everything for you!</w:t>
+      </w:r>
+    </w:p>
+    <w:p>
+      <w:pPr>
+        <w:spacing w:before="0" w:after="160"/>
+      </w:pPr>
+    </w:p>
     <w:p>
       <w:r>
         <w:rPr>
-          <w:i/>
+          <w:rFonts w:ascii="Georgia" w:hAnsi="Georgia"/>
+          <w:b/>
+          <w:color w:val="7C3AED"/>
+          <w:sz w:val="56"/>
         </w:rPr>
-        <w:t>Or just ask Claude Code: "Add a new project page for [client name]" and it does it all!</w:t>
+        <w:t xml:space="preserve">09  </w:t>
+      </w:r>
+      <w:r>
+        <w:rPr>
+          <w:rFonts w:ascii="Calibri" w:hAnsi="Calibri"/>
+          <w:b/>
+          <w:color w:val="1A1A2E"/>
+          <w:sz w:val="28"/>
+        </w:rPr>
+        <w:t>QUICK REFERENCE</w:t>
       </w:r>
     </w:p>
-    <w:p/>
     <w:p>
-      <w:pPr>
-        <w:pStyle w:val="Heading1"/>
-      </w:pPr>
       <w:r>
-        <w:t>9. Quick Reference: What File to Edit</w:t>
+        <w:rPr>
+          <w:color w:val="A78BFA"/>
+          <w:sz w:val="12"/>
+        </w:rPr>
+        <w:t>________________________________________________________________________</w:t>
       </w:r>
+    </w:p>
+    <w:p>
+      <w:pPr>
+        <w:spacing w:before="0" w:after="120"/>
+      </w:pPr>
     </w:p>
     <w:tbl>
       <w:tblPr>
-        <w:tblStyle w:val="LightGrid-Accent1"/>
         <w:tblW w:type="auto" w:w="0"/>
+        <w:jc w:val="center"/>
         <w:tblLook w:firstColumn="1" w:firstRow="1" w:lastColumn="0" w:lastRow="0" w:noHBand="0" w:noVBand="1" w:val="04A0"/>
+        <w:tblBorders>
+          <w:top w:val="single" w:sz="4" w:space="0" w:color="E0D8F0"/>
+          <w:left w:val="single" w:sz="4" w:space="0" w:color="E0D8F0"/>
+          <w:bottom w:val="single" w:sz="4" w:space="0" w:color="E0D8F0"/>
+          <w:right w:val="single" w:sz="4" w:space="0" w:color="E0D8F0"/>
+          <w:insideH w:val="single" w:sz="4" w:space="0" w:color="E0D8F0"/>
+          <w:insideV w:val="single" w:sz="4" w:space="0" w:color="E0D8F0"/>
+        </w:tblBorders>
       </w:tblPr>
       <w:tblGrid>
-        <w:gridCol w:w="4320"/>
-        <w:gridCol w:w="4320"/>
+        <w:gridCol w:w="4703"/>
+        <w:gridCol w:w="4703"/>
       </w:tblGrid>
       <w:tr>
         <w:tc>
           <w:tcPr>
-            <w:tcW w:type="dxa" w:w="4320"/>
+            <w:tcW w:type="dxa" w:w="4703"/>
+            <w:shd w:fill="7C3AED"/>
           </w:tcPr>
           <w:p>
+            <w:r/>
             <w:r>
+              <w:rPr>
+                <w:rFonts w:ascii="Calibri" w:hAnsi="Calibri"/>
+                <w:b/>
+                <w:color w:val="FFFFFF"/>
+                <w:sz w:val="20"/>
+              </w:rPr>
               <w:t>I want to change...</w:t>
             </w:r>
           </w:p>
         </w:tc>
         <w:tc>
           <w:tcPr>
-            <w:tcW w:type="dxa" w:w="4320"/>
+            <w:tcW w:type="dxa" w:w="4703"/>
+            <w:shd w:fill="7C3AED"/>
           </w:tcPr>
           <w:p>
+            <w:r/>
             <w:r>
+              <w:rPr>
+                <w:rFonts w:ascii="Calibri" w:hAnsi="Calibri"/>
+                <w:b/>
+                <w:color w:val="FFFFFF"/>
+                <w:sz w:val="20"/>
+              </w:rPr>
               <w:t>Edit this file</w:t>
             </w:r>
           </w:p>
@@ -794,20 +3427,32 @@
       <w:tr>
         <w:tc>
           <w:tcPr>
-            <w:tcW w:type="dxa" w:w="4320"/>
+            <w:tcW w:type="dxa" w:w="4703"/>
           </w:tcPr>
           <w:p>
+            <w:r/>
             <w:r>
+              <w:rPr>
+                <w:rFonts w:ascii="Calibri" w:hAnsi="Calibri"/>
+                <w:color w:val="1A1A2E"/>
+                <w:sz w:val="20"/>
+              </w:rPr>
               <w:t>Homepage text</w:t>
             </w:r>
           </w:p>
         </w:tc>
         <w:tc>
           <w:tcPr>
-            <w:tcW w:type="dxa" w:w="4320"/>
+            <w:tcW w:type="dxa" w:w="4703"/>
           </w:tcPr>
           <w:p>
+            <w:r/>
             <w:r>
+              <w:rPr>
+                <w:rFonts w:ascii="Calibri" w:hAnsi="Calibri"/>
+                <w:color w:val="1A1A2E"/>
+                <w:sz w:val="20"/>
+              </w:rPr>
               <w:t>index.html</w:t>
             </w:r>
           </w:p>
@@ -816,20 +3461,34 @@
       <w:tr>
         <w:tc>
           <w:tcPr>
-            <w:tcW w:type="dxa" w:w="4320"/>
+            <w:tcW w:type="dxa" w:w="4703"/>
+            <w:shd w:fill="F8F6FF"/>
           </w:tcPr>
           <w:p>
+            <w:r/>
             <w:r>
+              <w:rPr>
+                <w:rFonts w:ascii="Calibri" w:hAnsi="Calibri"/>
+                <w:color w:val="1A1A2E"/>
+                <w:sz w:val="20"/>
+              </w:rPr>
               <w:t>About page</w:t>
             </w:r>
           </w:p>
         </w:tc>
         <w:tc>
           <w:tcPr>
-            <w:tcW w:type="dxa" w:w="4320"/>
+            <w:tcW w:type="dxa" w:w="4703"/>
+            <w:shd w:fill="F8F6FF"/>
           </w:tcPr>
           <w:p>
+            <w:r/>
             <w:r>
+              <w:rPr>
+                <w:rFonts w:ascii="Calibri" w:hAnsi="Calibri"/>
+                <w:color w:val="1A1A2E"/>
+                <w:sz w:val="20"/>
+              </w:rPr>
               <w:t>about.html</w:t>
             </w:r>
           </w:p>
@@ -838,20 +3497,32 @@
       <w:tr>
         <w:tc>
           <w:tcPr>
-            <w:tcW w:type="dxa" w:w="4320"/>
+            <w:tcW w:type="dxa" w:w="4703"/>
           </w:tcPr>
           <w:p>
+            <w:r/>
             <w:r>
+              <w:rPr>
+                <w:rFonts w:ascii="Calibri" w:hAnsi="Calibri"/>
+                <w:color w:val="1A1A2E"/>
+                <w:sz w:val="20"/>
+              </w:rPr>
               <w:t>Services page</w:t>
             </w:r>
           </w:p>
         </w:tc>
         <w:tc>
           <w:tcPr>
-            <w:tcW w:type="dxa" w:w="4320"/>
+            <w:tcW w:type="dxa" w:w="4703"/>
           </w:tcPr>
           <w:p>
+            <w:r/>
             <w:r>
+              <w:rPr>
+                <w:rFonts w:ascii="Calibri" w:hAnsi="Calibri"/>
+                <w:color w:val="1A1A2E"/>
+                <w:sz w:val="20"/>
+              </w:rPr>
               <w:t>services.html</w:t>
             </w:r>
           </w:p>
@@ -860,20 +3531,34 @@
       <w:tr>
         <w:tc>
           <w:tcPr>
-            <w:tcW w:type="dxa" w:w="4320"/>
+            <w:tcW w:type="dxa" w:w="4703"/>
+            <w:shd w:fill="F8F6FF"/>
           </w:tcPr>
           <w:p>
+            <w:r/>
             <w:r>
-              <w:t>Work/Portfolio page</w:t>
+              <w:rPr>
+                <w:rFonts w:ascii="Calibri" w:hAnsi="Calibri"/>
+                <w:color w:val="1A1A2E"/>
+                <w:sz w:val="20"/>
+              </w:rPr>
+              <w:t>Work / Portfolio page</w:t>
             </w:r>
           </w:p>
         </w:tc>
         <w:tc>
           <w:tcPr>
-            <w:tcW w:type="dxa" w:w="4320"/>
+            <w:tcW w:type="dxa" w:w="4703"/>
+            <w:shd w:fill="F8F6FF"/>
           </w:tcPr>
           <w:p>
+            <w:r/>
             <w:r>
+              <w:rPr>
+                <w:rFonts w:ascii="Calibri" w:hAnsi="Calibri"/>
+                <w:color w:val="1A1A2E"/>
+                <w:sz w:val="20"/>
+              </w:rPr>
               <w:t>work.html</w:t>
             </w:r>
           </w:p>
@@ -882,20 +3567,32 @@
       <w:tr>
         <w:tc>
           <w:tcPr>
-            <w:tcW w:type="dxa" w:w="4320"/>
+            <w:tcW w:type="dxa" w:w="4703"/>
           </w:tcPr>
           <w:p>
+            <w:r/>
             <w:r>
+              <w:rPr>
+                <w:rFonts w:ascii="Calibri" w:hAnsi="Calibri"/>
+                <w:color w:val="1A1A2E"/>
+                <w:sz w:val="20"/>
+              </w:rPr>
               <w:t>Contact page</w:t>
             </w:r>
           </w:p>
         </w:tc>
         <w:tc>
           <w:tcPr>
-            <w:tcW w:type="dxa" w:w="4320"/>
+            <w:tcW w:type="dxa" w:w="4703"/>
           </w:tcPr>
           <w:p>
+            <w:r/>
             <w:r>
+              <w:rPr>
+                <w:rFonts w:ascii="Calibri" w:hAnsi="Calibri"/>
+                <w:color w:val="1A1A2E"/>
+                <w:sz w:val="20"/>
+              </w:rPr>
               <w:t>contact-us.html</w:t>
             </w:r>
           </w:p>
@@ -904,20 +3601,34 @@
       <w:tr>
         <w:tc>
           <w:tcPr>
-            <w:tcW w:type="dxa" w:w="4320"/>
+            <w:tcW w:type="dxa" w:w="4703"/>
+            <w:shd w:fill="F8F6FF"/>
           </w:tcPr>
           <w:p>
+            <w:r/>
             <w:r>
+              <w:rPr>
+                <w:rFonts w:ascii="Calibri" w:hAnsi="Calibri"/>
+                <w:color w:val="1A1A2E"/>
+                <w:sz w:val="20"/>
+              </w:rPr>
               <w:t>A project case study</w:t>
             </w:r>
           </w:p>
         </w:tc>
         <w:tc>
           <w:tcPr>
-            <w:tcW w:type="dxa" w:w="4320"/>
+            <w:tcW w:type="dxa" w:w="4703"/>
+            <w:shd w:fill="F8F6FF"/>
           </w:tcPr>
           <w:p>
+            <w:r/>
             <w:r>
+              <w:rPr>
+                <w:rFonts w:ascii="Calibri" w:hAnsi="Calibri"/>
+                <w:color w:val="1A1A2E"/>
+                <w:sz w:val="20"/>
+              </w:rPr>
               <w:t>work/[project-name].html</w:t>
             </w:r>
           </w:p>
@@ -926,20 +3637,32 @@
       <w:tr>
         <w:tc>
           <w:tcPr>
-            <w:tcW w:type="dxa" w:w="4320"/>
+            <w:tcW w:type="dxa" w:w="4703"/>
           </w:tcPr>
           <w:p>
+            <w:r/>
             <w:r>
+              <w:rPr>
+                <w:rFonts w:ascii="Calibri" w:hAnsi="Calibri"/>
+                <w:color w:val="1A1A2E"/>
+                <w:sz w:val="20"/>
+              </w:rPr>
               <w:t>Colors or fonts</w:t>
             </w:r>
           </w:p>
         </w:tc>
         <w:tc>
           <w:tcPr>
-            <w:tcW w:type="dxa" w:w="4320"/>
+            <w:tcW w:type="dxa" w:w="4703"/>
           </w:tcPr>
           <w:p>
+            <w:r/>
             <w:r>
+              <w:rPr>
+                <w:rFonts w:ascii="Calibri" w:hAnsi="Calibri"/>
+                <w:color w:val="1A1A2E"/>
+                <w:sz w:val="20"/>
+              </w:rPr>
               <w:t>css/shared.css</w:t>
             </w:r>
           </w:p>
@@ -948,20 +3671,34 @@
       <w:tr>
         <w:tc>
           <w:tcPr>
-            <w:tcW w:type="dxa" w:w="4320"/>
+            <w:tcW w:type="dxa" w:w="4703"/>
+            <w:shd w:fill="F8F6FF"/>
           </w:tcPr>
           <w:p>
+            <w:r/>
             <w:r>
+              <w:rPr>
+                <w:rFonts w:ascii="Calibri" w:hAnsi="Calibri"/>
+                <w:color w:val="1A1A2E"/>
+                <w:sz w:val="20"/>
+              </w:rPr>
               <w:t>The YouTube video</w:t>
             </w:r>
           </w:p>
         </w:tc>
         <w:tc>
           <w:tcPr>
-            <w:tcW w:type="dxa" w:w="4320"/>
+            <w:tcW w:type="dxa" w:w="4703"/>
+            <w:shd w:fill="F8F6FF"/>
           </w:tcPr>
           <w:p>
+            <w:r/>
             <w:r>
+              <w:rPr>
+                <w:rFonts w:ascii="Calibri" w:hAnsi="Calibri"/>
+                <w:color w:val="1A1A2E"/>
+                <w:sz w:val="20"/>
+              </w:rPr>
               <w:t>js/shared.js</w:t>
             </w:r>
           </w:p>
@@ -970,20 +3707,32 @@
       <w:tr>
         <w:tc>
           <w:tcPr>
-            <w:tcW w:type="dxa" w:w="4320"/>
+            <w:tcW w:type="dxa" w:w="4703"/>
           </w:tcPr>
           <w:p>
+            <w:r/>
             <w:r>
+              <w:rPr>
+                <w:rFonts w:ascii="Calibri" w:hAnsi="Calibri"/>
+                <w:color w:val="1A1A2E"/>
+                <w:sz w:val="20"/>
+              </w:rPr>
               <w:t>The logo</w:t>
             </w:r>
           </w:p>
         </w:tc>
         <w:tc>
           <w:tcPr>
-            <w:tcW w:type="dxa" w:w="4320"/>
+            <w:tcW w:type="dxa" w:w="4703"/>
           </w:tcPr>
           <w:p>
+            <w:r/>
             <w:r>
+              <w:rPr>
+                <w:rFonts w:ascii="Calibri" w:hAnsi="Calibri"/>
+                <w:color w:val="1A1A2E"/>
+                <w:sz w:val="20"/>
+              </w:rPr>
               <w:t>Replace images/dc-logo-full-white.svg</w:t>
             </w:r>
           </w:p>
@@ -992,21 +3741,35 @@
       <w:tr>
         <w:tc>
           <w:tcPr>
-            <w:tcW w:type="dxa" w:w="4320"/>
+            <w:tcW w:type="dxa" w:w="4703"/>
+            <w:shd w:fill="F8F6FF"/>
           </w:tcPr>
           <w:p>
+            <w:r/>
             <w:r>
-              <w:t>Navigation links or footer</w:t>
+              <w:rPr>
+                <w:rFonts w:ascii="Calibri" w:hAnsi="Calibri"/>
+                <w:color w:val="1A1A2E"/>
+                <w:sz w:val="20"/>
+              </w:rPr>
+              <w:t>Nav links or footer</w:t>
             </w:r>
           </w:p>
         </w:tc>
         <w:tc>
           <w:tcPr>
-            <w:tcW w:type="dxa" w:w="4320"/>
+            <w:tcW w:type="dxa" w:w="4703"/>
+            <w:shd w:fill="F8F6FF"/>
           </w:tcPr>
           <w:p>
+            <w:r/>
             <w:r>
-              <w:t>Every HTML file (ask Claude!)</w:t>
+              <w:rPr>
+                <w:rFonts w:ascii="Calibri" w:hAnsi="Calibri"/>
+                <w:color w:val="1A1A2E"/>
+                <w:sz w:val="20"/>
+              </w:rPr>
+              <w:t>Every HTML file (just ask Claude!)</w:t>
             </w:r>
           </w:p>
         </w:tc>
@@ -1015,96 +3778,273 @@
     <w:p/>
     <w:p>
       <w:pPr>
-        <w:pStyle w:val="Heading1"/>
-      </w:pPr>
+        <w:spacing w:before="0" w:after="160"/>
+      </w:pPr>
+    </w:p>
+    <w:p>
       <w:r>
-        <w:t>10. Help! Something Went Wrong</w:t>
+        <w:rPr>
+          <w:rFonts w:ascii="Georgia" w:hAnsi="Georgia"/>
+          <w:b/>
+          <w:color w:val="7C3AED"/>
+          <w:sz w:val="56"/>
+        </w:rPr>
+        <w:t xml:space="preserve">10  </w:t>
+      </w:r>
+      <w:r>
+        <w:rPr>
+          <w:rFonts w:ascii="Calibri" w:hAnsi="Calibri"/>
+          <w:b/>
+          <w:color w:val="1A1A2E"/>
+          <w:sz w:val="28"/>
+        </w:rPr>
+        <w:t>TROUBLESHOOTING</w:t>
       </w:r>
     </w:p>
     <w:p>
       <w:r>
         <w:rPr>
+          <w:color w:val="A78BFA"/>
+          <w:sz w:val="12"/>
+        </w:rPr>
+        <w:t>________________________________________________________________________</w:t>
+      </w:r>
+    </w:p>
+    <w:p>
+      <w:pPr>
+        <w:spacing w:before="0" w:after="120"/>
+      </w:pPr>
+    </w:p>
+    <w:p>
+      <w:pPr>
+        <w:spacing w:after="80" w:line="312" w:lineRule="auto"/>
+      </w:pPr>
+      <w:r>
+        <w:rPr>
+          <w:rFonts w:ascii="Calibri" w:hAnsi="Calibri"/>
           <w:b/>
+          <w:i w:val="0"/>
+          <w:sz w:val="24"/>
         </w:rPr>
         <w:t>My changes aren't showing up!</w:t>
       </w:r>
     </w:p>
     <w:p>
+      <w:pPr>
+        <w:pStyle w:val="ListBullet"/>
+        <w:spacing w:after="60" w:line="312" w:lineRule="auto"/>
+      </w:pPr>
       <w:r>
-        <w:t>• Did you push live? (Section 6)</w:t>
+        <w:rPr>
+          <w:rFonts w:ascii="Calibri" w:hAnsi="Calibri"/>
+          <w:color w:val="1A1A2E"/>
+          <w:sz w:val="22"/>
+        </w:rPr>
+        <w:t>Did you push live? (see Section 06)</w:t>
       </w:r>
     </w:p>
     <w:p>
-      <w:r>
-        <w:t>• Try refreshing with Cmd + Shift + R to clear your browser cache</w:t>
-      </w:r>
-    </w:p>
-    <w:p/>
-    <w:p>
+      <w:pPr>
+        <w:pStyle w:val="ListBullet"/>
+        <w:spacing w:after="60" w:line="312" w:lineRule="auto"/>
+      </w:pPr>
       <w:r>
         <w:rPr>
-          <w:b/>
+          <w:rFonts w:ascii="Calibri" w:hAnsi="Calibri"/>
+          <w:color w:val="1A1A2E"/>
+          <w:sz w:val="22"/>
         </w:rPr>
-        <w:t>The deploy command is giving an error!</w:t>
+        <w:t>Try a hard refresh: Cmd + Shift + R</w:t>
       </w:r>
     </w:p>
     <w:p>
+      <w:pPr>
+        <w:pStyle w:val="ListBullet"/>
+        <w:spacing w:after="60" w:line="312" w:lineRule="auto"/>
+      </w:pPr>
       <w:r>
-        <w:t>• Make sure you're in the right folder first: cd ~/Desktop/driven-creations-webflow</w:t>
+        <w:rPr>
+          <w:rFonts w:ascii="Calibri" w:hAnsi="Calibri"/>
+          <w:color w:val="1A1A2E"/>
+          <w:sz w:val="22"/>
+        </w:rPr>
+        <w:t>Vercel caches images for 30 days. If you replaced an image, use a new filename.</w:t>
       </w:r>
     </w:p>
     <w:p>
+      <w:pPr>
+        <w:spacing w:before="0" w:after="120"/>
+      </w:pPr>
+    </w:p>
+    <w:p>
+      <w:pPr>
+        <w:spacing w:after="80" w:line="312" w:lineRule="auto"/>
+      </w:pPr>
       <w:r>
-        <w:t>• Try logging in again: npx vercel login</w:t>
+        <w:rPr>
+          <w:rFonts w:ascii="Calibri" w:hAnsi="Calibri"/>
+          <w:b/>
+          <w:i w:val="0"/>
+          <w:sz w:val="24"/>
+        </w:rPr>
+        <w:t>The deploy command gives an error!</w:t>
       </w:r>
     </w:p>
-    <w:p/>
     <w:p>
+      <w:pPr>
+        <w:pStyle w:val="ListBullet"/>
+        <w:spacing w:after="60" w:line="312" w:lineRule="auto"/>
+      </w:pPr>
       <w:r>
         <w:rPr>
+          <w:rFonts w:ascii="Calibri" w:hAnsi="Calibri"/>
+          <w:color w:val="1A1A2E"/>
+          <w:sz w:val="22"/>
+        </w:rPr>
+        <w:t>Make sure you're in the right folder: cd ~/Desktop/driven-creations-webflow</w:t>
+      </w:r>
+    </w:p>
+    <w:p>
+      <w:pPr>
+        <w:pStyle w:val="ListBullet"/>
+        <w:spacing w:after="60" w:line="312" w:lineRule="auto"/>
+      </w:pPr>
+      <w:r>
+        <w:rPr>
+          <w:rFonts w:ascii="Calibri" w:hAnsi="Calibri"/>
+          <w:color w:val="1A1A2E"/>
+          <w:sz w:val="22"/>
+        </w:rPr>
+        <w:t>Try logging in again: npx vercel login</w:t>
+      </w:r>
+    </w:p>
+    <w:p>
+      <w:pPr>
+        <w:pStyle w:val="ListBullet"/>
+        <w:spacing w:after="60" w:line="312" w:lineRule="auto"/>
+      </w:pPr>
+      <w:r>
+        <w:rPr>
+          <w:rFonts w:ascii="Calibri" w:hAnsi="Calibri"/>
+          <w:color w:val="1A1A2E"/>
+          <w:sz w:val="22"/>
+        </w:rPr>
+        <w:t>If Git says "nothing to commit," your changes were already saved.</w:t>
+      </w:r>
+    </w:p>
+    <w:p>
+      <w:pPr>
+        <w:spacing w:before="0" w:after="120"/>
+      </w:pPr>
+    </w:p>
+    <w:p>
+      <w:pPr>
+        <w:spacing w:after="80" w:line="312" w:lineRule="auto"/>
+      </w:pPr>
+      <w:r>
+        <w:rPr>
+          <w:rFonts w:ascii="Calibri" w:hAnsi="Calibri"/>
           <w:b/>
+          <w:i w:val="0"/>
+          <w:sz w:val="24"/>
         </w:rPr>
         <w:t>I broke something!</w:t>
       </w:r>
     </w:p>
     <w:p>
+      <w:pPr>
+        <w:pStyle w:val="ListBullet"/>
+        <w:spacing w:after="60" w:line="312" w:lineRule="auto"/>
+      </w:pPr>
       <w:r>
-        <w:t>• Don't panic! Open Terminal, type claude, and say "Help, I broke the site!"</w:t>
+        <w:rPr>
+          <w:rFonts w:ascii="Calibri" w:hAnsi="Calibri"/>
+          <w:color w:val="1A1A2E"/>
+          <w:sz w:val="22"/>
+        </w:rPr>
+        <w:t>Don't panic! Open Terminal, type claude, and say "Help, I broke the site!"</w:t>
       </w:r>
     </w:p>
     <w:p>
-      <w:r>
-        <w:t>• Claude can check what went wrong and fix it for you.</w:t>
-      </w:r>
-    </w:p>
-    <w:p/>
-    <w:p/>
-    <w:p>
-      <w:pPr>
-        <w:jc w:val="center"/>
+      <w:pPr>
+        <w:pStyle w:val="ListBullet"/>
+        <w:spacing w:after="60" w:line="312" w:lineRule="auto"/>
       </w:pPr>
       <w:r>
         <w:rPr>
-          <w:i/>
+          <w:rFonts w:ascii="Calibri" w:hAnsi="Calibri"/>
+          <w:color w:val="1A1A2E"/>
+          <w:sz w:val="22"/>
         </w:rPr>
-        <w:t>— End of Guide —</w:t>
+        <w:t>Claude will check what went wrong and fix it.</w:t>
       </w:r>
     </w:p>
     <w:p>
       <w:pPr>
-        <w:jc w:val="center"/>
+        <w:pStyle w:val="ListBullet"/>
+        <w:spacing w:after="60" w:line="312" w:lineRule="auto"/>
       </w:pPr>
       <w:r>
         <w:rPr>
-          <w:color w:val="999999"/>
+          <w:rFonts w:ascii="Calibri" w:hAnsi="Calibri"/>
+          <w:color w:val="1A1A2E"/>
+          <w:sz w:val="22"/>
+        </w:rPr>
+        <w:t>You can also say: "Undo all changes since the last deploy"</w:t>
+      </w:r>
+    </w:p>
+    <w:p>
+      <w:pPr>
+        <w:spacing w:before="0" w:after="320"/>
+      </w:pPr>
+    </w:p>
+    <w:p>
+      <w:pPr>
+        <w:jc w:val="center"/>
+      </w:pPr>
+      <w:r>
+        <w:rPr>
+          <w:color w:val="A78BFA"/>
+          <w:sz w:val="28"/>
+        </w:rPr>
+        <w:t>_______________</w:t>
+      </w:r>
+    </w:p>
+    <w:p>
+      <w:pPr>
+        <w:spacing w:before="0" w:after="80"/>
+      </w:pPr>
+    </w:p>
+    <w:p>
+      <w:pPr>
+        <w:jc w:val="center"/>
+      </w:pPr>
+      <w:r>
+        <w:rPr>
+          <w:rFonts w:ascii="Georgia" w:hAnsi="Georgia"/>
+          <w:b/>
+          <w:color w:val="7C3AED"/>
           <w:sz w:val="20"/>
         </w:rPr>
-        <w:t>Last Updated: February 23, 2026</w:t>
+        <w:t>DRIVEN CREATIONS</w:t>
+      </w:r>
+    </w:p>
+    <w:p>
+      <w:pPr>
+        <w:jc w:val="center"/>
+      </w:pPr>
+      <w:r>
+        <w:rPr>
+          <w:rFonts w:ascii="Calibri" w:hAnsi="Calibri"/>
+          <w:color w:val="6B6B6B"/>
+          <w:sz w:val="18"/>
+        </w:rPr>
+        <w:t>drivencreations.com</w:t>
       </w:r>
     </w:p>
     <w:sectPr>
       <w:pgSz w:w="12240" w:h="15840"/>
-      <w:pgMar w:top="1440" w:right="1800" w:bottom="1440" w:left="1800" w:header="720" w:footer="720" w:gutter="0"/>
+      <w:pgMar w:top="1417" w:right="1417" w:bottom="1417" w:left="1417" w:header="720" w:footer="720" w:gutter="0"/>
       <w:cols w:space="720"/>
       <w:docGrid w:linePitch="360"/>
     </w:sectPr>
@@ -1475,10 +4415,6 @@
     <w:name w:val="Normal"/>
     <w:qFormat/>
     <w:rsid w:val="00FC693F"/>
-    <w:rPr>
-      <w:rFonts w:ascii="Arial" w:hAnsi="Arial"/>
-      <w:sz w:val="24"/>
-    </w:rPr>
   </w:style>
   <w:style w:type="paragraph" w:styleId="Header">
     <w:name w:val="header"/>

</xml_diff>